<commit_message>
Ütü·Final·Paket 8 adım: belgeler güncellendi/yeni yazıldı, manifest ve atıf haritası yenilendi
Co-Authored-By: Claude Sonnet 5.5 <noreply@anthropic.com>
Claude-Session: https://claude.ai/code/session_01J6foNXTwf1dGzDjULYpfrk
</commit_message>
<xml_diff>
--- a/prosedurler/EMS.DP.TL.08.04. Carton Marking, Labelling and Packing List Instruction.docx
+++ b/prosedurler/EMS.DP.TL.08.04. Carton Marking, Labelling and Packing List Instruction.docx
@@ -32,7 +32,7 @@
           <w:sz w:val="24"/>
           <w:szCs w:val="24"/>
         </w:rPr>
-        <w:t xml:space="preserve">This instruction describes how export cartons are marked and labelled, how the packing list and delivery note are prepared and checked, how the load is sealed and how order, batch and lot data are recorded at Eroglu Knitting (EMS), so that every carton can be identified, traced and received by the customer without errors. It combines the former carton marking instruction with the QMS instructions EMS.DP.TL.08.04 (delivery note, packing list and sealing) and EMS.DP.TL.08.04 (order-batch-lot record).</w:t>
+        <w:t xml:space="preserve">This instruction describes how export cartons are marked and labelled, how the lot label is placed and recorded, how the packing list and delivery note are prepared and checked, how the load is sealed and how order, batch and lot data are recorded at Eroglu Knitting (EMS), so that every carton can be identified, traced and received by the customer without errors. It is the instruction of step 7 (cartoning) of the department flow in EMS.ÜR.PRO.05.10 and continues with step 8, the final inspection (EMS.QA.PRO.02.14), before loading. It combines the former carton marking instruction with the former QMS instructions on the delivery note, packing list and sealing, and on the order-batch-lot record, and is consistent with EMS.SO.PRO.23.07.</w:t>
       </w:r>
     </w:p>
     <w:p>
@@ -73,7 +73,7 @@
           <w:sz w:val="24"/>
           <w:szCs w:val="24"/>
         </w:rPr>
-        <w:t xml:space="preserve">This instruction applies to all export and domestic cartons prepared in the packing section and the finished goods warehouse, to the packing list and delivery note issued for each shipment, to the sealing of vehicles and containers and to the traceability record kept after dispatch. The packing steps themselves are described in EMS.SO.PRO.23.07. and the dispatch process in EMS.DP.PRO.08.02.</w:t>
+        <w:t xml:space="preserve">This instruction applies to all export and domestic cartons prepared in the packing section and the finished goods warehouse, to the packing list and delivery note issued for each shipment, to the sealing of vehicles and containers and to the traceability record kept after dispatch. The packing steps themselves are described in EMS.SO.PRO.23.07, the folding and polybag packing in EMS.ÜR.TL.05.13, the lot numbering in EMS.ÜR.PRO.05.12 and EMS.ÜR.TL.05.14 and the dispatch process in EMS.DP.PRO.08.02.</w:t>
       </w:r>
     </w:p>
     <w:p>
@@ -705,7 +705,7 @@
           <w:sz w:val="24"/>
           <w:szCs w:val="24"/>
         </w:rPr>
-        <w:t xml:space="preserve">1.4. Check that the goods to be packed carry the quality release status (final inspection passed); do not pack goods that are on hold.</w:t>
+        <w:t xml:space="preserve">1.4. Check that the goods to be cartoned come from a lot whose records are complete: quality control, pressing, optical control, metal detector record (EMS.QA.FRM.03.07) and lot label (EMS.ÜR.FRM.05.10). Do not pack goods that are on hold or have no detector record. The release of the lot is given by the final inspection (step 8) and is checked again before loading.</w:t>
       </w:r>
     </w:p>
     <w:p>
@@ -746,7 +746,7 @@
           <w:sz w:val="24"/>
           <w:szCs w:val="24"/>
         </w:rPr>
-        <w:t xml:space="preserve">2.1. Write or print on each carton at least: customer order number, style, colour, size or assortment, quantity, carton number (e.g. 1/250), net and gross weight, carton dimensions and "Made in Egypt".</w:t>
+        <w:t xml:space="preserve">2.1. Write or print on each carton at least: customer order number, style, colour, size or assortment, quantity, carton number (e.g. 1/250), lot number, net and gross weight, carton dimensions and "Made in Egypt".</w:t>
       </w:r>
     </w:p>
     <w:p>
@@ -810,7 +810,23 @@
           <w:sz w:val="24"/>
           <w:szCs w:val="24"/>
         </w:rPr>
-        <w:t xml:space="preserve">2.5. The Packing Supervisor and Quality Assurance approve the first packed carton of each order (marks, labels, contents and weight) before mass packing continues.</w:t>
+        <w:t xml:space="preserve">2.5. Apply the lot label prepared under EMS.ÜR.TL.05.14 on the carton in the position defined there; the lot number on the label, the carton and the packing list must be identical. Record the carton numbers and the lot number on the Carton Arrangement and Packing List Control Form (EMS.ÜR.FRM.05.11).</w:t>
+      </w:r>
+    </w:p>
+    <w:p>
+      <w:pPr>
+        <w:pStyle w:val="ListeParagraf"/>
+        <w:spacing w:after="80"/>
+        <w:ind w:left="709" w:right="0"/>
+        <w:jc w:val="both"/>
+      </w:pPr>
+      <w:r>
+        <w:rPr>
+          <w:rFonts w:ascii="Calibri" w:hAnsi="Calibri" w:cs="Arial"/>
+          <w:sz w:val="24"/>
+          <w:szCs w:val="24"/>
+        </w:rPr>
+        <w:t xml:space="preserve">2.6. The Packing Supervisor and Quality Assurance approve the first packed carton of each order (marks, labels, contents and weight) before mass packing continues.</w:t>
       </w:r>
     </w:p>
     <w:p>
@@ -851,7 +867,7 @@
           <w:sz w:val="24"/>
           <w:szCs w:val="24"/>
         </w:rPr>
-        <w:t xml:space="preserve">3.1. Record for each carton: carton number, style, colour, size breakdown, quantity, net and gross weight and dimensions.</w:t>
+        <w:t xml:space="preserve">3.1. Record for each carton: carton number, style, colour, size breakdown, quantity, lot number, net and gross weight and dimensions.</w:t>
       </w:r>
     </w:p>
     <w:p>
@@ -908,7 +924,7 @@
           <w:sz w:val="24"/>
           <w:szCs w:val="24"/>
         </w:rPr>
-        <w:t xml:space="preserve">4. DELIVERY NOTE, SEALING AND DISPATCH (EMS.DP.TL.08.04)</w:t>
+        <w:t xml:space="preserve">4. DELIVERY NOTE, SEALING AND DISPATCH</w:t>
       </w:r>
     </w:p>
     <w:p>
@@ -988,7 +1004,23 @@
           <w:sz w:val="24"/>
           <w:szCs w:val="24"/>
         </w:rPr>
-        <w:t xml:space="preserve">4.5. The exit form is signed by the Warehouse Manager's representative, Quality Assurance and Security; driver identity and plate number are recorded. If document, quantity or seal data do not match, the exit is stopped until the difference is resolved.</w:t>
+        <w:t xml:space="preserve">4.5. Load only lots that carry the PASS result of the final inspection (EMS.QA.FRM.05.05) and the release label of Quality Assurance (EMS.QA.PRO.02.14). Security and the Shipping Clerk do not accept a carton of a lot without release.</w:t>
+      </w:r>
+    </w:p>
+    <w:p>
+      <w:pPr>
+        <w:pStyle w:val="ListeParagraf"/>
+        <w:spacing w:after="80"/>
+        <w:ind w:left="709" w:right="0"/>
+        <w:jc w:val="both"/>
+      </w:pPr>
+      <w:r>
+        <w:rPr>
+          <w:rFonts w:ascii="Calibri" w:hAnsi="Calibri" w:cs="Arial"/>
+          <w:sz w:val="24"/>
+          <w:szCs w:val="24"/>
+        </w:rPr>
+        <w:t xml:space="preserve">4.6. The exit form is signed by the Warehouse Manager's representative, Quality Assurance and Security; driver identity and plate number are recorded. If document, quantity or seal data do not match, the exit is stopped until the difference is resolved.</w:t>
       </w:r>
     </w:p>
     <w:p>
@@ -1013,7 +1045,7 @@
           <w:sz w:val="24"/>
           <w:szCs w:val="24"/>
         </w:rPr>
-        <w:t xml:space="preserve">5. ORDER-BATCH-LOT RECORD (EMS.DP.TL.08.04)</w:t>
+        <w:t xml:space="preserve">5. ORDER-BATCH-LOT RECORD</w:t>
       </w:r>
     </w:p>
     <w:p>
@@ -1029,7 +1061,7 @@
           <w:sz w:val="24"/>
           <w:szCs w:val="24"/>
         </w:rPr>
-        <w:t xml:space="preserve">5.1. After dispatch, record the order, batch and lot numbers of the goods, carton range, seal number, vehicle plate, dispatch date and delivery information in the traceability record.</w:t>
+        <w:t xml:space="preserve">5.1. After dispatch, record the order, batch and lot numbers (as on the lot labels) of the goods, carton range, seal number, vehicle plate, dispatch date and delivery information in the traceability record.</w:t>
       </w:r>
     </w:p>
     <w:p>
@@ -1105,7 +1137,7 @@
           <w:sz w:val="24"/>
           <w:szCs w:val="24"/>
         </w:rPr>
-        <w:t xml:space="preserve">Carton marks, labels and numbers: 100 % conform to the customer packing instruction; barcode readable by scanner.</w:t>
+        <w:t xml:space="preserve">Carton marks, labels, lot labels and numbers: 100 % conform to the customer packing instruction; barcode readable by scanner; lot number identical on label, carton and packing list.</w:t>
       </w:r>
     </w:p>
     <w:p>
@@ -1399,7 +1431,7 @@
           <w:sz w:val="24"/>
           <w:szCs w:val="24"/>
         </w:rPr>
-        <w:t xml:space="preserve">EMS.DP.PRO.08.02. Shipment and Dispatch Procedure</w:t>
+        <w:t xml:space="preserve">EMS.ÜR.PRO.05.10. Pressing, Final Control and Packing Procedure</w:t>
       </w:r>
     </w:p>
     <w:p>
@@ -1418,7 +1450,7 @@
           <w:sz w:val="24"/>
           <w:szCs w:val="24"/>
         </w:rPr>
-        <w:t xml:space="preserve">EMS.QA.PRO.02.04. Seal Management Procedure</w:t>
+        <w:t xml:space="preserve">EMS.ÜR.PRO.05.12. Finished Goods Lotting and Lot Identification Procedure</w:t>
       </w:r>
     </w:p>
     <w:p>
@@ -1437,7 +1469,7 @@
           <w:sz w:val="24"/>
           <w:szCs w:val="24"/>
         </w:rPr>
-        <w:t xml:space="preserve">EMS.QA.PRO.02.08. Traceability and Product Recall Procedure</w:t>
+        <w:t xml:space="preserve">EMS.ÜR.TL.05.14. Finished Goods Lot Numbering and Labelling Instruction</w:t>
       </w:r>
     </w:p>
     <w:p>
@@ -1456,7 +1488,7 @@
           <w:sz w:val="24"/>
           <w:szCs w:val="24"/>
         </w:rPr>
-        <w:t xml:space="preserve">EMS.İD.PRO.03.05. Container and Truck Loading Security Procedure</w:t>
+        <w:t xml:space="preserve">EMS.ÜR.TL.05.13. Folding, Polybag and Packing Instruction</w:t>
       </w:r>
     </w:p>
     <w:p>
@@ -1475,7 +1507,7 @@
           <w:sz w:val="24"/>
           <w:szCs w:val="24"/>
         </w:rPr>
-        <w:t xml:space="preserve">EMS.KS.PRO.22.02. Nonconforming Product Control Procedure</w:t>
+        <w:t xml:space="preserve">EMS.QA.PRO.02.14. Final Inspection and Release Procedure</w:t>
       </w:r>
     </w:p>
     <w:p>
@@ -1494,7 +1526,7 @@
           <w:sz w:val="24"/>
           <w:szCs w:val="24"/>
         </w:rPr>
-        <w:t xml:space="preserve">EMS.KS.PRO.22.03. Corrective and Preventive Action (CAPA) for Quality Problems Procedure</w:t>
+        <w:t xml:space="preserve">EMS.ÜR.FRM.05.11 Carton Arrangement and Packing List Control Form; EMS.ÜR.FRM.05.10 Lotting and Lot Label Record Form; EMS.QA.FRM.05.05 Pre-Shipment Final Inspection Report</w:t>
       </w:r>
     </w:p>
     <w:p>
@@ -1513,7 +1545,7 @@
           <w:sz w:val="24"/>
           <w:szCs w:val="24"/>
         </w:rPr>
-        <w:t xml:space="preserve">QMS: EMS.DP.TL.08.04, EMS.DP.TL.08.04, EMS.DP.PRO.08.02, EMS.DP.FRM.08.04 Loading Control Form, EMS.DP.FRM.08.05 Dispatch Exit Form, EMS.DP.FRM.08.06 Traceability Record Form</w:t>
+        <w:t xml:space="preserve">EMS.DP.PRO.08.02. Shipment and Dispatch Procedure</w:t>
       </w:r>
     </w:p>
     <w:p>
@@ -1532,1271 +1564,7 @@
           <w:sz w:val="24"/>
           <w:szCs w:val="24"/>
         </w:rPr>
-        <w:t xml:space="preserve">Customer Packing Instruction, Carton Mark Layout, Packing Lists, Delivery Notes, Seal Photos</w:t>
-      </w:r>
-    </w:p>
-    <w:p>
-      <w:pPr>
-        <w:pStyle w:val="ListeParagraf"/>
-        <w:spacing w:after="80"/>
-        <w:ind w:left="709" w:right="0"/>
-        <w:jc w:val="both"/>
-      </w:pPr>
-    </w:p>
-    <w:p>
-      <w:pPr>
-        <w:pStyle w:val="ListeParagraf"/>
-        <w:spacing w:before="120" w:after="60"/>
-        <w:ind w:left="709" w:right="0"/>
-      </w:pPr>
-      <w:r>
-        <w:rPr>
-          <w:rFonts w:ascii="Calibri" w:hAnsi="Calibri" w:cs="Arial"/>
-          <w:b/>
-          <w:bCs/>
-          <w:sz w:val="24"/>
-          <w:szCs w:val="24"/>
-        </w:rPr>
-        <w:t xml:space="preserve">10. FEEDBACK AND MONITORING</w:t>
-      </w:r>
-    </w:p>
-    <w:p>
-      <w:pPr>
-        <w:pStyle w:val="ListeParagraf"/>
-        <w:spacing w:after="80"/>
-        <w:ind w:left="709" w:right="0"/>
-        <w:jc w:val="both"/>
-      </w:pPr>
-      <w:r>
-        <w:rPr>
-          <w:rFonts w:ascii="Calibri" w:hAnsi="Calibri" w:cs="Arial"/>
-          <w:sz w:val="24"/>
-          <w:szCs w:val="24"/>
-        </w:rPr>
-        <w:t xml:space="preserve">The Warehouse Manager reviews labelling and packing list errors found in carton audits or reported by customers monthly, together with the KPIs: wrong or short shipments 0, dispatches stopped for seal or document mismatch 0, on-time shipping at least 98 % and backward tracing time of 4 hours or less. This instruction is reviewed every year.</w:t>
-      </w:r>
-    </w:p>
-    <w:p>
-      <w:r>
-        <w:br w:type="page"/>
-      </w:r>
-    </w:p>
-    <w:p>
-      <w:pPr>
-        <w:pStyle w:val="ListeParagraf"/>
-        <w:bidi/>
-        <w:spacing w:before="120" w:after="60"/>
-        <w:ind w:left="0" w:right="709"/>
-      </w:pPr>
-      <w:r>
-        <w:rPr>
-          <w:rFonts w:ascii="Calibri" w:hAnsi="Calibri" w:cs="Arial"/>
-          <w:b/>
-          <w:bCs/>
-          <w:rtl/>
-          <w:sz w:val="24"/>
-          <w:szCs w:val="24"/>
-        </w:rPr>
-        <w:t xml:space="preserve">الغرض</w:t>
-      </w:r>
-    </w:p>
-    <w:p>
-      <w:pPr>
-        <w:pStyle w:val="ListeParagraf"/>
-        <w:bidi/>
-        <w:spacing w:after="80"/>
-        <w:ind w:left="0" w:right="709"/>
-        <w:jc w:val="both"/>
-      </w:pPr>
-      <w:r>
-        <w:rPr>
-          <w:rFonts w:ascii="Calibri" w:hAnsi="Calibri" w:cs="Arial"/>
-          <w:rtl/>
-          <w:sz w:val="24"/>
-          <w:szCs w:val="24"/>
-        </w:rPr>
-        <w:t xml:space="preserve">توضح هذه التعليمات كيفية وضع العلامات والملصقات على كراتين التصدير، وكيفية إعداد قائمة التعبئة وسند التسليم والتحقق منهما، وكيفية ختم الحمولة وتسجيل بيانات الطلبية والدفعة واللوط في شركة إيروغلو للتريكو (EMS)، بحيث يمكن تمييز كل كرتونة وتتبعها واستلامها من قبل العميل دون أخطاء. وهي تجمع تعليمات وضع علامات الكراتين السابقة مع تعليمات نظام الجودة EMS.DP.TL.08.04 (سند التسليم وقائمة التعبئة والختم) وEMS.DP.TL.08.04 (سجل الطلبية والدفعة واللوط).</w:t>
-      </w:r>
-    </w:p>
-    <w:p>
-      <w:pPr>
-        <w:pStyle w:val="ListeParagraf"/>
-        <w:bidi/>
-        <w:spacing w:after="80"/>
-        <w:ind w:left="0" w:right="709"/>
-        <w:jc w:val="both"/>
-      </w:pPr>
-    </w:p>
-    <w:p>
-      <w:pPr>
-        <w:pStyle w:val="ListeParagraf"/>
-        <w:bidi/>
-        <w:spacing w:before="120" w:after="60"/>
-        <w:ind w:left="0" w:right="709"/>
-      </w:pPr>
-      <w:r>
-        <w:rPr>
-          <w:rFonts w:ascii="Calibri" w:hAnsi="Calibri" w:cs="Arial"/>
-          <w:b/>
-          <w:bCs/>
-          <w:rtl/>
-          <w:sz w:val="24"/>
-          <w:szCs w:val="24"/>
-        </w:rPr>
-        <w:t xml:space="preserve">النطاق</w:t>
-      </w:r>
-    </w:p>
-    <w:p>
-      <w:pPr>
-        <w:pStyle w:val="ListeParagraf"/>
-        <w:bidi/>
-        <w:spacing w:after="80"/>
-        <w:ind w:left="0" w:right="709"/>
-        <w:jc w:val="both"/>
-      </w:pPr>
-      <w:r>
-        <w:rPr>
-          <w:rFonts w:ascii="Calibri" w:hAnsi="Calibri" w:cs="Arial"/>
-          <w:rtl/>
-          <w:sz w:val="24"/>
-          <w:szCs w:val="24"/>
-        </w:rPr>
-        <w:t xml:space="preserve">تنطبق هذه التعليمات على جميع كراتين التصدير والسوق المحلي المعدة في قسم التعبئة ومستودع المنتجات التامة، وعلى قائمة التعبئة وسند التسليم الصادرين لكل شحنة، وعلى ختم المركبات والحاويات، وعلى سجل التتبع المحفوظ بعد الإرسال. أما خطوات التعبئة نفسها فموضحة في EMS.SO.PRO.23.07. وعملية الشحن في EMS.DP.PRO.08.02.</w:t>
-      </w:r>
-    </w:p>
-    <w:p>
-      <w:pPr>
-        <w:pStyle w:val="ListeParagraf"/>
-        <w:bidi/>
-        <w:spacing w:after="80"/>
-        <w:ind w:left="0" w:right="709"/>
-        <w:jc w:val="both"/>
-      </w:pPr>
-    </w:p>
-    <w:p>
-      <w:pPr>
-        <w:pStyle w:val="ListeParagraf"/>
-        <w:bidi/>
-        <w:spacing w:before="120" w:after="60"/>
-        <w:ind w:left="0" w:right="709"/>
-      </w:pPr>
-      <w:r>
-        <w:rPr>
-          <w:rFonts w:ascii="Calibri" w:hAnsi="Calibri" w:cs="Arial"/>
-          <w:b/>
-          <w:bCs/>
-          <w:rtl/>
-          <w:sz w:val="24"/>
-          <w:szCs w:val="24"/>
-        </w:rPr>
-        <w:t xml:space="preserve">المسؤوليات</w:t>
-      </w:r>
-    </w:p>
-    <w:p>
-      <w:pPr>
-        <w:pStyle w:val="ListeParagraf"/>
-        <w:bidi/>
-        <w:spacing w:after="80"/>
-        <w:ind w:left="0" w:right="709"/>
-        <w:jc w:val="both"/>
-      </w:pPr>
-      <w:r>
-        <w:rPr>
-          <w:rFonts w:ascii="Calibri" w:hAnsi="Calibri" w:cs="Arial"/>
-          <w:rtl/>
-          <w:sz w:val="24"/>
-          <w:szCs w:val="24"/>
-        </w:rPr>
-        <w:t xml:space="preserve">• </w:t>
-      </w:r>
-      <w:r>
-        <w:rPr>
-          <w:rFonts w:ascii="Calibri" w:hAnsi="Calibri" w:cs="Arial"/>
-          <w:b/>
-          <w:bCs/>
-          <w:rtl/>
-          <w:sz w:val="24"/>
-          <w:szCs w:val="24"/>
-        </w:rPr>
-        <w:t xml:space="preserve">مدير المستودعات:</w:t>
-      </w:r>
-      <w:r>
-        <w:rPr>
-          <w:rFonts w:ascii="Calibri" w:hAnsi="Calibri" w:cs="Arial"/>
-          <w:rtl/>
-          <w:sz w:val="24"/>
-          <w:szCs w:val="24"/>
-        </w:rPr>
-        <w:t xml:space="preserve"> يضمن تطبيق هذه التعليمات واعتماد قوائم التعبئة قبل التحميل والتصريح بأي تغيير بعد التحميل ومراجعة اتجاهات الأخطاء شهريًا.</w:t>
-      </w:r>
-    </w:p>
-    <w:p>
-      <w:pPr>
-        <w:pStyle w:val="ListeParagraf"/>
-        <w:bidi/>
-        <w:spacing w:after="80"/>
-        <w:ind w:left="0" w:right="709"/>
-        <w:jc w:val="both"/>
-      </w:pPr>
-      <w:r>
-        <w:rPr>
-          <w:rFonts w:ascii="Calibri" w:hAnsi="Calibri" w:cs="Arial"/>
-          <w:rtl/>
-          <w:sz w:val="24"/>
-          <w:szCs w:val="24"/>
-        </w:rPr>
-        <w:t xml:space="preserve">• </w:t>
-      </w:r>
-      <w:r>
-        <w:rPr>
-          <w:rFonts w:ascii="Calibri" w:hAnsi="Calibri" w:cs="Arial"/>
-          <w:b/>
-          <w:bCs/>
-          <w:rtl/>
-          <w:sz w:val="24"/>
-          <w:szCs w:val="24"/>
-        </w:rPr>
-        <w:t xml:space="preserve">مشرف التعبئة:</w:t>
-      </w:r>
-      <w:r>
-        <w:rPr>
-          <w:rFonts w:ascii="Calibri" w:hAnsi="Calibri" w:cs="Arial"/>
-          <w:rtl/>
-          <w:sz w:val="24"/>
-          <w:szCs w:val="24"/>
-        </w:rPr>
-        <w:t xml:space="preserve"> يتأكد من استخدام العلامات والملصقات وأرقام الكراتين الصحيحة والمعتمدة لكل طلبية، ومن اعتماد أول كرتونة في كل طلبية قبل بدء التعبئة الكمية.</w:t>
-      </w:r>
-    </w:p>
-    <w:p>
-      <w:pPr>
-        <w:pStyle w:val="ListeParagraf"/>
-        <w:bidi/>
-        <w:spacing w:after="80"/>
-        <w:ind w:left="0" w:right="709"/>
-        <w:jc w:val="both"/>
-      </w:pPr>
-      <w:r>
-        <w:rPr>
-          <w:rFonts w:ascii="Calibri" w:hAnsi="Calibri" w:cs="Arial"/>
-          <w:rtl/>
-          <w:sz w:val="24"/>
-          <w:szCs w:val="24"/>
-        </w:rPr>
-        <w:t xml:space="preserve">• </w:t>
-      </w:r>
-      <w:r>
-        <w:rPr>
-          <w:rFonts w:ascii="Calibri" w:hAnsi="Calibri" w:cs="Arial"/>
-          <w:b/>
-          <w:bCs/>
-          <w:rtl/>
-          <w:sz w:val="24"/>
-          <w:szCs w:val="24"/>
-        </w:rPr>
-        <w:t xml:space="preserve">عمال التعبئة / وضع الملصقات:</w:t>
-      </w:r>
-      <w:r>
-        <w:rPr>
-          <w:rFonts w:ascii="Calibri" w:hAnsi="Calibri" w:cs="Arial"/>
-          <w:rtl/>
-          <w:sz w:val="24"/>
-          <w:szCs w:val="24"/>
-        </w:rPr>
-        <w:t xml:space="preserve"> يضعون العلامات والملصقات وفق هذه التعليمات وتعليمات التعبئة الخاصة بالعميل.</w:t>
-      </w:r>
-    </w:p>
-    <w:p>
-      <w:pPr>
-        <w:pStyle w:val="ListeParagraf"/>
-        <w:bidi/>
-        <w:spacing w:after="80"/>
-        <w:ind w:left="0" w:right="709"/>
-        <w:jc w:val="both"/>
-      </w:pPr>
-      <w:r>
-        <w:rPr>
-          <w:rFonts w:ascii="Calibri" w:hAnsi="Calibri" w:cs="Arial"/>
-          <w:rtl/>
-          <w:sz w:val="24"/>
-          <w:szCs w:val="24"/>
-        </w:rPr>
-        <w:t xml:space="preserve">• </w:t>
-      </w:r>
-      <w:r>
-        <w:rPr>
-          <w:rFonts w:ascii="Calibri" w:hAnsi="Calibri" w:cs="Arial"/>
-          <w:b/>
-          <w:bCs/>
-          <w:rtl/>
-          <w:sz w:val="24"/>
-          <w:szCs w:val="24"/>
-        </w:rPr>
-        <w:t xml:space="preserve">موظف الشحن:</w:t>
-      </w:r>
-      <w:r>
-        <w:rPr>
-          <w:rFonts w:ascii="Calibri" w:hAnsi="Calibri" w:cs="Arial"/>
-          <w:rtl/>
-          <w:sz w:val="24"/>
-          <w:szCs w:val="24"/>
-        </w:rPr>
-        <w:t xml:space="preserve"> يعد قائمة التعبئة وسند التسليم ويطابقهما مع الكراتين الفعلية قبل التحميل، ويضع الختم، ويستكمل سجلات الإرسال والتتبع.</w:t>
-      </w:r>
-    </w:p>
-    <w:p>
-      <w:pPr>
-        <w:pStyle w:val="ListeParagraf"/>
-        <w:bidi/>
-        <w:spacing w:after="80"/>
-        <w:ind w:left="0" w:right="709"/>
-        <w:jc w:val="both"/>
-      </w:pPr>
-      <w:r>
-        <w:rPr>
-          <w:rFonts w:ascii="Calibri" w:hAnsi="Calibri" w:cs="Arial"/>
-          <w:rtl/>
-          <w:sz w:val="24"/>
-          <w:szCs w:val="24"/>
-        </w:rPr>
-        <w:t xml:space="preserve">• </w:t>
-      </w:r>
-      <w:r>
-        <w:rPr>
-          <w:rFonts w:ascii="Calibri" w:hAnsi="Calibri" w:cs="Arial"/>
-          <w:b/>
-          <w:bCs/>
-          <w:rtl/>
-          <w:sz w:val="24"/>
-          <w:szCs w:val="24"/>
-        </w:rPr>
-        <w:t xml:space="preserve">ضمان الجودة:</w:t>
-      </w:r>
-      <w:r>
-        <w:rPr>
-          <w:rFonts w:ascii="Calibri" w:hAnsi="Calibri" w:cs="Arial"/>
-          <w:rtl/>
-          <w:sz w:val="24"/>
-          <w:szCs w:val="24"/>
-        </w:rPr>
-        <w:t xml:space="preserve"> يفحص العلامات والملصقات وقائمة التعبئة أثناء تدقيق الكراتين، ويتحقق من حالة الإفراج عن البضاعة، ويحتفظ بسجل التتبع.</w:t>
-      </w:r>
-    </w:p>
-    <w:p>
-      <w:pPr>
-        <w:pStyle w:val="ListeParagraf"/>
-        <w:bidi/>
-        <w:spacing w:after="80"/>
-        <w:ind w:left="0" w:right="709"/>
-        <w:jc w:val="both"/>
-      </w:pPr>
-      <w:r>
-        <w:rPr>
-          <w:rFonts w:ascii="Calibri" w:hAnsi="Calibri" w:cs="Arial"/>
-          <w:rtl/>
-          <w:sz w:val="24"/>
-          <w:szCs w:val="24"/>
-        </w:rPr>
-        <w:t xml:space="preserve">• </w:t>
-      </w:r>
-      <w:r>
-        <w:rPr>
-          <w:rFonts w:ascii="Calibri" w:hAnsi="Calibri" w:cs="Arial"/>
-          <w:b/>
-          <w:bCs/>
-          <w:rtl/>
-          <w:sz w:val="24"/>
-          <w:szCs w:val="24"/>
-        </w:rPr>
-        <w:t xml:space="preserve">الأمن:</w:t>
-      </w:r>
-      <w:r>
-        <w:rPr>
-          <w:rFonts w:ascii="Calibri" w:hAnsi="Calibri" w:cs="Arial"/>
-          <w:rtl/>
-          <w:sz w:val="24"/>
-          <w:szCs w:val="24"/>
-        </w:rPr>
-        <w:t xml:space="preserve"> يفحص المستندات والمركبة ورقم الختم عند البوابة ويوقف الخروج عند عدم التطابق.</w:t>
-      </w:r>
-    </w:p>
-    <w:p>
-      <w:pPr>
-        <w:pStyle w:val="ListeParagraf"/>
-        <w:bidi/>
-        <w:spacing w:after="80"/>
-        <w:ind w:left="0" w:right="709"/>
-        <w:jc w:val="both"/>
-      </w:pPr>
-      <w:r>
-        <w:rPr>
-          <w:rFonts w:ascii="Calibri" w:hAnsi="Calibri" w:cs="Arial"/>
-          <w:rtl/>
-          <w:sz w:val="24"/>
-          <w:szCs w:val="24"/>
-        </w:rPr>
-        <w:t xml:space="preserve">• </w:t>
-      </w:r>
-      <w:r>
-        <w:rPr>
-          <w:rFonts w:ascii="Calibri" w:hAnsi="Calibri" w:cs="Arial"/>
-          <w:b/>
-          <w:bCs/>
-          <w:rtl/>
-          <w:sz w:val="24"/>
-          <w:szCs w:val="24"/>
-        </w:rPr>
-        <w:t xml:space="preserve">الميرشندايزينغ:</w:t>
-      </w:r>
-      <w:r>
-        <w:rPr>
-          <w:rFonts w:ascii="Calibri" w:hAnsi="Calibri" w:cs="Arial"/>
-          <w:rtl/>
-          <w:sz w:val="24"/>
-          <w:szCs w:val="24"/>
-        </w:rPr>
-        <w:t xml:space="preserve"> يوفر تعليمات التعبئة المعتمدة من العميل وتصميم علامات الكراتين وتوزيع المقاسات، ويستلم قائمة التعبئة النهائية.</w:t>
-      </w:r>
-    </w:p>
-    <w:p>
-      <w:pPr>
-        <w:pStyle w:val="ListeParagraf"/>
-        <w:bidi/>
-        <w:spacing w:after="80"/>
-        <w:ind w:left="0" w:right="709"/>
-        <w:jc w:val="both"/>
-      </w:pPr>
-      <w:r>
-        <w:rPr>
-          <w:rFonts w:ascii="Calibri" w:hAnsi="Calibri" w:cs="Arial"/>
-          <w:rtl/>
-          <w:sz w:val="24"/>
-          <w:szCs w:val="24"/>
-        </w:rPr>
-        <w:t xml:space="preserve">• </w:t>
-      </w:r>
-      <w:r>
-        <w:rPr>
-          <w:rFonts w:ascii="Calibri" w:hAnsi="Calibri" w:cs="Arial"/>
-          <w:b/>
-          <w:bCs/>
-          <w:rtl/>
-          <w:sz w:val="24"/>
-          <w:szCs w:val="24"/>
-        </w:rPr>
-        <w:t xml:space="preserve">مدير المصنع:</w:t>
-      </w:r>
-      <w:r>
-        <w:rPr>
-          <w:rFonts w:ascii="Calibri" w:hAnsi="Calibri" w:cs="Arial"/>
-          <w:rtl/>
-          <w:sz w:val="24"/>
-          <w:szCs w:val="24"/>
-        </w:rPr>
-        <w:t xml:space="preserve"> يراجع أخطاء الشحن ويعتمد الاستثناءات.</w:t>
-      </w:r>
-    </w:p>
-    <w:p>
-      <w:pPr>
-        <w:pStyle w:val="ListeParagraf"/>
-        <w:bidi/>
-        <w:spacing w:after="80"/>
-        <w:ind w:left="0" w:right="709"/>
-        <w:jc w:val="both"/>
-      </w:pPr>
-    </w:p>
-    <w:p>
-      <w:pPr>
-        <w:pStyle w:val="ListeParagraf"/>
-        <w:bidi/>
-        <w:spacing w:before="120" w:after="60"/>
-        <w:ind w:left="0" w:right="709"/>
-      </w:pPr>
-      <w:r>
-        <w:rPr>
-          <w:rFonts w:ascii="Calibri" w:hAnsi="Calibri" w:cs="Arial"/>
-          <w:b/>
-          <w:bCs/>
-          <w:rtl/>
-          <w:sz w:val="24"/>
-          <w:szCs w:val="24"/>
-        </w:rPr>
-        <w:t xml:space="preserve">التعريفات</w:t>
-      </w:r>
-    </w:p>
-    <w:p>
-      <w:pPr>
-        <w:pStyle w:val="ListeParagraf"/>
-        <w:bidi/>
-        <w:spacing w:after="80"/>
-        <w:ind w:left="0" w:right="709"/>
-        <w:jc w:val="both"/>
-      </w:pPr>
-      <w:r>
-        <w:rPr>
-          <w:rFonts w:ascii="Calibri" w:hAnsi="Calibri" w:cs="Arial"/>
-          <w:rtl/>
-          <w:sz w:val="24"/>
-          <w:szCs w:val="24"/>
-        </w:rPr>
-        <w:t xml:space="preserve">• </w:t>
-      </w:r>
-      <w:r>
-        <w:rPr>
-          <w:rFonts w:ascii="Calibri" w:hAnsi="Calibri" w:cs="Arial"/>
-          <w:b/>
-          <w:bCs/>
-          <w:rtl/>
-          <w:sz w:val="24"/>
-          <w:szCs w:val="24"/>
-        </w:rPr>
-        <w:t xml:space="preserve">العلامة الرئيسية / الجانبية:</w:t>
-      </w:r>
-      <w:r>
-        <w:rPr>
-          <w:rFonts w:ascii="Calibri" w:hAnsi="Calibri" w:cs="Arial"/>
-          <w:rtl/>
-          <w:sz w:val="24"/>
-          <w:szCs w:val="24"/>
-        </w:rPr>
-        <w:t xml:space="preserve"> بيانات الشحن المطبوعة أو الملصقة على الجانبين الطويل والقصير للكرتونة حسب متطلبات العميل.</w:t>
-      </w:r>
-    </w:p>
-    <w:p>
-      <w:pPr>
-        <w:pStyle w:val="ListeParagraf"/>
-        <w:bidi/>
-        <w:spacing w:after="80"/>
-        <w:ind w:left="0" w:right="709"/>
-        <w:jc w:val="both"/>
-      </w:pPr>
-      <w:r>
-        <w:rPr>
-          <w:rFonts w:ascii="Calibri" w:hAnsi="Calibri" w:cs="Arial"/>
-          <w:rtl/>
-          <w:sz w:val="24"/>
-          <w:szCs w:val="24"/>
-        </w:rPr>
-        <w:t xml:space="preserve">• </w:t>
-      </w:r>
-      <w:r>
-        <w:rPr>
-          <w:rFonts w:ascii="Calibri" w:hAnsi="Calibri" w:cs="Arial"/>
-          <w:b/>
-          <w:bCs/>
-          <w:rtl/>
-          <w:sz w:val="24"/>
-          <w:szCs w:val="24"/>
-        </w:rPr>
-        <w:t xml:space="preserve">ملصق الكرتونة (SSCC / ملصق الباركود):</w:t>
-      </w:r>
-      <w:r>
-        <w:rPr>
-          <w:rFonts w:ascii="Calibri" w:hAnsi="Calibri" w:cs="Arial"/>
-          <w:rtl/>
-          <w:sz w:val="24"/>
-          <w:szCs w:val="24"/>
-        </w:rPr>
-        <w:t xml:space="preserve"> ملصق العميل الذي يحمل باركودًا فريدًا لكل كرتونة ومرتبطًا بقائمة التعبئة.</w:t>
-      </w:r>
-    </w:p>
-    <w:p>
-      <w:pPr>
-        <w:pStyle w:val="ListeParagraf"/>
-        <w:bidi/>
-        <w:spacing w:after="80"/>
-        <w:ind w:left="0" w:right="709"/>
-        <w:jc w:val="both"/>
-      </w:pPr>
-      <w:r>
-        <w:rPr>
-          <w:rFonts w:ascii="Calibri" w:hAnsi="Calibri" w:cs="Arial"/>
-          <w:rtl/>
-          <w:sz w:val="24"/>
-          <w:szCs w:val="24"/>
-        </w:rPr>
-        <w:t xml:space="preserve">• </w:t>
-      </w:r>
-      <w:r>
-        <w:rPr>
-          <w:rFonts w:ascii="Calibri" w:hAnsi="Calibri" w:cs="Arial"/>
-          <w:b/>
-          <w:bCs/>
-          <w:rtl/>
-          <w:sz w:val="24"/>
-          <w:szCs w:val="24"/>
-        </w:rPr>
-        <w:t xml:space="preserve">قائمة التعبئة:</w:t>
-      </w:r>
-      <w:r>
-        <w:rPr>
-          <w:rFonts w:ascii="Calibri" w:hAnsi="Calibri" w:cs="Arial"/>
-          <w:rtl/>
-          <w:sz w:val="24"/>
-          <w:szCs w:val="24"/>
-        </w:rPr>
-        <w:t xml:space="preserve"> مستند الشحن الذي يبين رقم كل كرتونة والموديل واللون وتوزيع المقاسات والكمية والوزن والأبعاد.</w:t>
-      </w:r>
-    </w:p>
-    <w:p>
-      <w:pPr>
-        <w:pStyle w:val="ListeParagraf"/>
-        <w:bidi/>
-        <w:spacing w:after="80"/>
-        <w:ind w:left="0" w:right="709"/>
-        <w:jc w:val="both"/>
-      </w:pPr>
-      <w:r>
-        <w:rPr>
-          <w:rFonts w:ascii="Calibri" w:hAnsi="Calibri" w:cs="Arial"/>
-          <w:rtl/>
-          <w:sz w:val="24"/>
-          <w:szCs w:val="24"/>
-        </w:rPr>
-        <w:t xml:space="preserve">• </w:t>
-      </w:r>
-      <w:r>
-        <w:rPr>
-          <w:rFonts w:ascii="Calibri" w:hAnsi="Calibri" w:cs="Arial"/>
-          <w:b/>
-          <w:bCs/>
-          <w:rtl/>
-          <w:sz w:val="24"/>
-          <w:szCs w:val="24"/>
-        </w:rPr>
-        <w:t xml:space="preserve">سند التسليم:</w:t>
-      </w:r>
-      <w:r>
-        <w:rPr>
-          <w:rFonts w:ascii="Calibri" w:hAnsi="Calibri" w:cs="Arial"/>
-          <w:rtl/>
-          <w:sz w:val="24"/>
-          <w:szCs w:val="24"/>
-        </w:rPr>
-        <w:t xml:space="preserve"> المستند الذي يثبت خروج البضاعة من المصنع.</w:t>
-      </w:r>
-    </w:p>
-    <w:p>
-      <w:pPr>
-        <w:pStyle w:val="ListeParagraf"/>
-        <w:bidi/>
-        <w:spacing w:after="80"/>
-        <w:ind w:left="0" w:right="709"/>
-        <w:jc w:val="both"/>
-      </w:pPr>
-      <w:r>
-        <w:rPr>
-          <w:rFonts w:ascii="Calibri" w:hAnsi="Calibri" w:cs="Arial"/>
-          <w:rtl/>
-          <w:sz w:val="24"/>
-          <w:szCs w:val="24"/>
-        </w:rPr>
-        <w:t xml:space="preserve">• </w:t>
-      </w:r>
-      <w:r>
-        <w:rPr>
-          <w:rFonts w:ascii="Calibri" w:hAnsi="Calibri" w:cs="Arial"/>
-          <w:b/>
-          <w:bCs/>
-          <w:rtl/>
-          <w:sz w:val="24"/>
-          <w:szCs w:val="24"/>
-        </w:rPr>
-        <w:t xml:space="preserve">الختم:</w:t>
-      </w:r>
-      <w:r>
-        <w:rPr>
-          <w:rFonts w:ascii="Calibri" w:hAnsi="Calibri" w:cs="Arial"/>
-          <w:rtl/>
-          <w:sz w:val="24"/>
-          <w:szCs w:val="24"/>
-        </w:rPr>
-        <w:t xml:space="preserve"> إغلاق مرقم يدل على العبث، يوضع على المركبة أو الحاوية بعد التحميل (ISO 17712 للأختام المسمارية عالية الأمان).</w:t>
-      </w:r>
-    </w:p>
-    <w:p>
-      <w:pPr>
-        <w:pStyle w:val="ListeParagraf"/>
-        <w:bidi/>
-        <w:spacing w:after="80"/>
-        <w:ind w:left="0" w:right="709"/>
-        <w:jc w:val="both"/>
-      </w:pPr>
-      <w:r>
-        <w:rPr>
-          <w:rFonts w:ascii="Calibri" w:hAnsi="Calibri" w:cs="Arial"/>
-          <w:rtl/>
-          <w:sz w:val="24"/>
-          <w:szCs w:val="24"/>
-        </w:rPr>
-        <w:t xml:space="preserve">• </w:t>
-      </w:r>
-      <w:r>
-        <w:rPr>
-          <w:rFonts w:ascii="Calibri" w:hAnsi="Calibri" w:cs="Arial"/>
-          <w:b/>
-          <w:bCs/>
-          <w:rtl/>
-          <w:sz w:val="24"/>
-          <w:szCs w:val="24"/>
-        </w:rPr>
-        <w:t xml:space="preserve">سجل الطلبية والدفعة واللوط:</w:t>
-      </w:r>
-      <w:r>
-        <w:rPr>
-          <w:rFonts w:ascii="Calibri" w:hAnsi="Calibri" w:cs="Arial"/>
-          <w:rtl/>
-          <w:sz w:val="24"/>
-          <w:szCs w:val="24"/>
-        </w:rPr>
-        <w:t xml:space="preserve"> السجل الذي يربط كل شحنة بالطلبية ودفعة الإنتاج واللوط بحيث يمكن تتبع البضاعة للخلف وللأمام.</w:t>
-      </w:r>
-    </w:p>
-    <w:p>
-      <w:pPr>
-        <w:pStyle w:val="ListeParagraf"/>
-        <w:bidi/>
-        <w:spacing w:after="80"/>
-        <w:ind w:left="0" w:right="709"/>
-        <w:jc w:val="both"/>
-      </w:pPr>
-    </w:p>
-    <w:p>
-      <w:pPr>
-        <w:pStyle w:val="ListeParagraf"/>
-        <w:bidi/>
-        <w:spacing w:before="120" w:after="60"/>
-        <w:ind w:left="0" w:right="709"/>
-      </w:pPr>
-      <w:r>
-        <w:rPr>
-          <w:rFonts w:ascii="Calibri" w:hAnsi="Calibri" w:cs="Arial"/>
-          <w:b/>
-          <w:bCs/>
-          <w:rtl/>
-          <w:sz w:val="24"/>
-          <w:szCs w:val="24"/>
-        </w:rPr>
-        <w:t xml:space="preserve">التعليمات</w:t>
-      </w:r>
-    </w:p>
-    <w:p>
-      <w:pPr>
-        <w:pStyle w:val="ListeParagraf"/>
-        <w:bidi/>
-        <w:spacing w:before="120" w:after="60"/>
-        <w:ind w:left="0" w:right="709"/>
-      </w:pPr>
-      <w:r>
-        <w:rPr>
-          <w:rFonts w:ascii="Calibri" w:hAnsi="Calibri" w:cs="Arial"/>
-          <w:b/>
-          <w:bCs/>
-          <w:rtl/>
-          <w:sz w:val="24"/>
-          <w:szCs w:val="24"/>
-        </w:rPr>
-        <w:t xml:space="preserve">1. قبل البدء</w:t>
-      </w:r>
-    </w:p>
-    <w:p>
-      <w:pPr>
-        <w:pStyle w:val="ListeParagraf"/>
-        <w:bidi/>
-        <w:spacing w:after="80"/>
-        <w:ind w:left="0" w:right="709"/>
-        <w:jc w:val="both"/>
-      </w:pPr>
-      <w:r>
-        <w:rPr>
-          <w:rFonts w:ascii="Calibri" w:hAnsi="Calibri" w:cs="Arial"/>
-          <w:rtl/>
-          <w:sz w:val="24"/>
-          <w:szCs w:val="24"/>
-        </w:rPr>
-        <w:t xml:space="preserve">1.1. احصل من قسم الميرشندايزينغ على أحدث تعليمات تعبئة معتمدة من العميل وتصميم علامات الكراتين وملف الملصقات وتوزيع مقاسات الطلبية، وتحقق من تاريخ المراجعة.</w:t>
-      </w:r>
-    </w:p>
-    <w:p>
-      <w:pPr>
-        <w:pStyle w:val="ListeParagraf"/>
-        <w:bidi/>
-        <w:spacing w:after="80"/>
-        <w:ind w:left="0" w:right="709"/>
-        <w:jc w:val="both"/>
-      </w:pPr>
-      <w:r>
-        <w:rPr>
-          <w:rFonts w:ascii="Calibri" w:hAnsi="Calibri" w:cs="Arial"/>
-          <w:rtl/>
-          <w:sz w:val="24"/>
-          <w:szCs w:val="24"/>
-        </w:rPr>
-        <w:t xml:space="preserve">1.2. اطبع ملصقًا تجريبيًا وتحقق من قراءة الباركود بالماسح الضوئي، وتأكد من صحة رقم الطلبية والموديل واللون والمقاس والكمية.</w:t>
-      </w:r>
-    </w:p>
-    <w:p>
-      <w:pPr>
-        <w:pStyle w:val="ListeParagraf"/>
-        <w:bidi/>
-        <w:spacing w:after="80"/>
-        <w:ind w:left="0" w:right="709"/>
-        <w:jc w:val="both"/>
-      </w:pPr>
-      <w:r>
-        <w:rPr>
-          <w:rFonts w:ascii="Calibri" w:hAnsi="Calibri" w:cs="Arial"/>
-          <w:rtl/>
-          <w:sz w:val="24"/>
-          <w:szCs w:val="24"/>
-        </w:rPr>
-        <w:t xml:space="preserve">1.3. احتفظ على طاولة التعبئة بملصقات وعلامات طلبية واحدة فقط في كل مرة.</w:t>
-      </w:r>
-    </w:p>
-    <w:p>
-      <w:pPr>
-        <w:pStyle w:val="ListeParagraf"/>
-        <w:bidi/>
-        <w:spacing w:after="80"/>
-        <w:ind w:left="0" w:right="709"/>
-        <w:jc w:val="both"/>
-      </w:pPr>
-      <w:r>
-        <w:rPr>
-          <w:rFonts w:ascii="Calibri" w:hAnsi="Calibri" w:cs="Arial"/>
-          <w:rtl/>
-          <w:sz w:val="24"/>
-          <w:szCs w:val="24"/>
-        </w:rPr>
-        <w:t xml:space="preserve">1.4. تأكد من أن البضاعة المراد تعبئتها تحمل حالة الإفراج عن الجودة (اجتازت الفحص النهائي)؛ ولا تعبئ بضاعة موقوفة.</w:t>
-      </w:r>
-    </w:p>
-    <w:p>
-      <w:pPr>
-        <w:pStyle w:val="ListeParagraf"/>
-        <w:bidi/>
-        <w:spacing w:after="80"/>
-        <w:ind w:left="0" w:right="709"/>
-        <w:jc w:val="both"/>
-      </w:pPr>
-    </w:p>
-    <w:p>
-      <w:pPr>
-        <w:pStyle w:val="ListeParagraf"/>
-        <w:bidi/>
-        <w:spacing w:before="120" w:after="60"/>
-        <w:ind w:left="0" w:right="709"/>
-      </w:pPr>
-      <w:r>
-        <w:rPr>
-          <w:rFonts w:ascii="Calibri" w:hAnsi="Calibri" w:cs="Arial"/>
-          <w:b/>
-          <w:bCs/>
-          <w:rtl/>
-          <w:sz w:val="24"/>
-          <w:szCs w:val="24"/>
-        </w:rPr>
-        <w:t xml:space="preserve">2. وضع العلامات والملصقات</w:t>
-      </w:r>
-    </w:p>
-    <w:p>
-      <w:pPr>
-        <w:pStyle w:val="ListeParagraf"/>
-        <w:bidi/>
-        <w:spacing w:after="80"/>
-        <w:ind w:left="0" w:right="709"/>
-        <w:jc w:val="both"/>
-      </w:pPr>
-      <w:r>
-        <w:rPr>
-          <w:rFonts w:ascii="Calibri" w:hAnsi="Calibri" w:cs="Arial"/>
-          <w:rtl/>
-          <w:sz w:val="24"/>
-          <w:szCs w:val="24"/>
-        </w:rPr>
-        <w:t xml:space="preserve">2.1. اكتب أو اطبع على كل كرتونة على الأقل: رقم طلبية العميل والموديل واللون والمقاس أو التشكيلة والكمية ورقم الكرتونة (مثل 1/250) والوزن الصافي والإجمالي وأبعاد الكرتونة وعبارة «صُنع في مصر» (Made in Egypt).</w:t>
-      </w:r>
-    </w:p>
-    <w:p>
-      <w:pPr>
-        <w:pStyle w:val="ListeParagraf"/>
-        <w:bidi/>
-        <w:spacing w:after="80"/>
-        <w:ind w:left="0" w:right="709"/>
-        <w:jc w:val="both"/>
-      </w:pPr>
-      <w:r>
-        <w:rPr>
-          <w:rFonts w:ascii="Calibri" w:hAnsi="Calibri" w:cs="Arial"/>
-          <w:rtl/>
-          <w:sz w:val="24"/>
-          <w:szCs w:val="24"/>
-        </w:rPr>
-        <w:t xml:space="preserve">2.2. ضع ملصقات الباركود مستوية ومستقيمة وفي الموضع الذي يحدده العميل؛ ولا تضعها أبدًا فوق خط لصق أو شريط أو حافة.</w:t>
-      </w:r>
-    </w:p>
-    <w:p>
-      <w:pPr>
-        <w:pStyle w:val="ListeParagraf"/>
-        <w:bidi/>
-        <w:spacing w:after="80"/>
-        <w:ind w:left="0" w:right="709"/>
-        <w:jc w:val="both"/>
-      </w:pPr>
-      <w:r>
-        <w:rPr>
-          <w:rFonts w:ascii="Calibri" w:hAnsi="Calibri" w:cs="Arial"/>
-          <w:rtl/>
-          <w:sz w:val="24"/>
-          <w:szCs w:val="24"/>
-        </w:rPr>
-        <w:t xml:space="preserve">2.3. أضف علامات المناولة والمحتوى (مثل ادعاء GRS/RCS أو OCS، قابل للكسر، هذا الجانب للأعلى) فقط عند طلبها واعتمادها.</w:t>
-      </w:r>
-    </w:p>
-    <w:p>
-      <w:pPr>
-        <w:pStyle w:val="ListeParagraf"/>
-        <w:bidi/>
-        <w:spacing w:after="80"/>
-        <w:ind w:left="0" w:right="709"/>
-        <w:jc w:val="both"/>
-      </w:pPr>
-      <w:r>
-        <w:rPr>
-          <w:rFonts w:ascii="Calibri" w:hAnsi="Calibri" w:cs="Arial"/>
-          <w:rtl/>
-          <w:sz w:val="24"/>
-          <w:szCs w:val="24"/>
-        </w:rPr>
-        <w:t xml:space="preserve">2.4. أعطِ أرقام الكراتين بتسلسل متصل لكل طلبية، ولا تكرر أي رقم أو تتخطاه، وسجل الأرقام الملغاة.</w:t>
-      </w:r>
-    </w:p>
-    <w:p>
-      <w:pPr>
-        <w:pStyle w:val="ListeParagraf"/>
-        <w:bidi/>
-        <w:spacing w:after="80"/>
-        <w:ind w:left="0" w:right="709"/>
-        <w:jc w:val="both"/>
-      </w:pPr>
-      <w:r>
-        <w:rPr>
-          <w:rFonts w:ascii="Calibri" w:hAnsi="Calibri" w:cs="Arial"/>
-          <w:rtl/>
-          <w:sz w:val="24"/>
-          <w:szCs w:val="24"/>
-        </w:rPr>
-        <w:t xml:space="preserve">2.5. يعتمد مشرف التعبئة وضمان الجودة أول كرتونة معبأة في كل طلبية (العلامات والملصقات والمحتوى والوزن) قبل استمرار التعبئة الكمية.</w:t>
-      </w:r>
-    </w:p>
-    <w:p>
-      <w:pPr>
-        <w:pStyle w:val="ListeParagraf"/>
-        <w:bidi/>
-        <w:spacing w:after="80"/>
-        <w:ind w:left="0" w:right="709"/>
-        <w:jc w:val="both"/>
-      </w:pPr>
-    </w:p>
-    <w:p>
-      <w:pPr>
-        <w:pStyle w:val="ListeParagraf"/>
-        <w:bidi/>
-        <w:spacing w:before="120" w:after="60"/>
-        <w:ind w:left="0" w:right="709"/>
-      </w:pPr>
-      <w:r>
-        <w:rPr>
-          <w:rFonts w:ascii="Calibri" w:hAnsi="Calibri" w:cs="Arial"/>
-          <w:b/>
-          <w:bCs/>
-          <w:rtl/>
-          <w:sz w:val="24"/>
-          <w:szCs w:val="24"/>
-        </w:rPr>
-        <w:t xml:space="preserve">3. قائمة التعبئة</w:t>
-      </w:r>
-    </w:p>
-    <w:p>
-      <w:pPr>
-        <w:pStyle w:val="ListeParagraf"/>
-        <w:bidi/>
-        <w:spacing w:after="80"/>
-        <w:ind w:left="0" w:right="709"/>
-        <w:jc w:val="both"/>
-      </w:pPr>
-      <w:r>
-        <w:rPr>
-          <w:rFonts w:ascii="Calibri" w:hAnsi="Calibri" w:cs="Arial"/>
-          <w:rtl/>
-          <w:sz w:val="24"/>
-          <w:szCs w:val="24"/>
-        </w:rPr>
-        <w:t xml:space="preserve">3.1. سجل لكل كرتونة: رقم الكرتونة والموديل واللون وتوزيع المقاسات والكمية والوزن الصافي والإجمالي والأبعاد.</w:t>
-      </w:r>
-    </w:p>
-    <w:p>
-      <w:pPr>
-        <w:pStyle w:val="ListeParagraf"/>
-        <w:bidi/>
-        <w:spacing w:after="80"/>
-        <w:ind w:left="0" w:right="709"/>
-        <w:jc w:val="both"/>
-      </w:pPr>
-      <w:r>
-        <w:rPr>
-          <w:rFonts w:ascii="Calibri" w:hAnsi="Calibri" w:cs="Arial"/>
-          <w:rtl/>
-          <w:sz w:val="24"/>
-          <w:szCs w:val="24"/>
-        </w:rPr>
-        <w:t xml:space="preserve">3.2. طابق الإجماليات حسب الطلبية واللون والمقاس مع كمية الطلبية والكراتين الفعلية، وصحح أي فرق قبل الإفراج.</w:t>
-      </w:r>
-    </w:p>
-    <w:p>
-      <w:pPr>
-        <w:pStyle w:val="ListeParagraf"/>
-        <w:bidi/>
-        <w:spacing w:after="80"/>
-        <w:ind w:left="0" w:right="709"/>
-        <w:jc w:val="both"/>
-      </w:pPr>
-      <w:r>
-        <w:rPr>
-          <w:rFonts w:ascii="Calibri" w:hAnsi="Calibri" w:cs="Arial"/>
-          <w:rtl/>
-          <w:sz w:val="24"/>
-          <w:szCs w:val="24"/>
-        </w:rPr>
-        <w:t xml:space="preserve">3.3. أرسل قائمة التعبئة النهائية الموقعة من موظف الشحن إلى قسم الميرشندايزينغ وإلى الأمن لمراقبة التحميل (EMS.İD.PRO.03.05.).</w:t>
-      </w:r>
-    </w:p>
-    <w:p>
-      <w:pPr>
-        <w:pStyle w:val="ListeParagraf"/>
-        <w:bidi/>
-        <w:spacing w:after="80"/>
-        <w:ind w:left="0" w:right="709"/>
-        <w:jc w:val="both"/>
-      </w:pPr>
-    </w:p>
-    <w:p>
-      <w:pPr>
-        <w:pStyle w:val="ListeParagraf"/>
-        <w:bidi/>
-        <w:spacing w:before="120" w:after="60"/>
-        <w:ind w:left="0" w:right="709"/>
-      </w:pPr>
-      <w:r>
-        <w:rPr>
-          <w:rFonts w:ascii="Calibri" w:hAnsi="Calibri" w:cs="Arial"/>
-          <w:b/>
-          <w:bCs/>
-          <w:rtl/>
-          <w:sz w:val="24"/>
-          <w:szCs w:val="24"/>
-        </w:rPr>
-        <w:t xml:space="preserve">4. سند التسليم والختم والإرسال (EMS.DP.TL.08.04)</w:t>
-      </w:r>
-    </w:p>
-    <w:p>
-      <w:pPr>
-        <w:pStyle w:val="ListeParagraf"/>
-        <w:bidi/>
-        <w:spacing w:after="80"/>
-        <w:ind w:left="0" w:right="709"/>
-        <w:jc w:val="both"/>
-      </w:pPr>
-      <w:r>
-        <w:rPr>
-          <w:rFonts w:ascii="Calibri" w:hAnsi="Calibri" w:cs="Arial"/>
-          <w:rtl/>
-          <w:sz w:val="24"/>
-          <w:szCs w:val="24"/>
-        </w:rPr>
-        <w:t xml:space="preserve">4.1. أعد سند التسليم ومستندات التصدير المطلوبة بما يتفق مع أمر الشحن وقائمة التعبئة؛ ويجب أن تطابق الكمية وعدد الكراتين والوزن قائمة التعبئة تمامًا.</w:t>
-      </w:r>
-    </w:p>
-    <w:p>
-      <w:pPr>
-        <w:pStyle w:val="ListeParagraf"/>
-        <w:bidi/>
-        <w:spacing w:after="80"/>
-        <w:ind w:left="0" w:right="709"/>
-        <w:jc w:val="both"/>
-      </w:pPr>
-      <w:r>
-        <w:rPr>
-          <w:rFonts w:ascii="Calibri" w:hAnsi="Calibri" w:cs="Arial"/>
-          <w:rtl/>
-          <w:sz w:val="24"/>
-          <w:szCs w:val="24"/>
-        </w:rPr>
-        <w:t xml:space="preserve">4.2. قبل التحميل، عدّ الكراتين والباليتات ومطابقتها مع قائمة التعبئة؛ ولا تحمّل كرتونة ذات ملصق ناقص أو زائد أو خاطئ.</w:t>
-      </w:r>
-    </w:p>
-    <w:p>
-      <w:pPr>
-        <w:pStyle w:val="ListeParagraf"/>
-        <w:bidi/>
-        <w:spacing w:after="80"/>
-        <w:ind w:left="0" w:right="709"/>
-        <w:jc w:val="both"/>
-      </w:pPr>
-      <w:r>
-        <w:rPr>
-          <w:rFonts w:ascii="Calibri" w:hAnsi="Calibri" w:cs="Arial"/>
-          <w:rtl/>
-          <w:sz w:val="24"/>
-          <w:szCs w:val="24"/>
-        </w:rPr>
-        <w:t xml:space="preserve">4.3. بعد إغلاق الأبواب، اختم المركبة أو الحاوية بختم مرقم مطابق لـ ISO 17712 بحضور الأمن، وتحقق من الختم بالشد والتدوير.</w:t>
-      </w:r>
-    </w:p>
-    <w:p>
-      <w:pPr>
-        <w:pStyle w:val="ListeParagraf"/>
-        <w:bidi/>
-        <w:spacing w:after="80"/>
-        <w:ind w:left="0" w:right="709"/>
-        <w:jc w:val="both"/>
-      </w:pPr>
-      <w:r>
-        <w:rPr>
-          <w:rFonts w:ascii="Calibri" w:hAnsi="Calibri" w:cs="Arial"/>
-          <w:rtl/>
-          <w:sz w:val="24"/>
-          <w:szCs w:val="24"/>
-        </w:rPr>
-        <w:t xml:space="preserve">4.4. اكتب رقم الختم على سند التسليم وقائمة التعبئة ونموذج التحميل، والتقط صورة للختم وفق EMS.QA.PRO.02.04.</w:t>
-      </w:r>
-    </w:p>
-    <w:p>
-      <w:pPr>
-        <w:pStyle w:val="ListeParagraf"/>
-        <w:bidi/>
-        <w:spacing w:after="80"/>
-        <w:ind w:left="0" w:right="709"/>
-        <w:jc w:val="both"/>
-      </w:pPr>
-      <w:r>
-        <w:rPr>
-          <w:rFonts w:ascii="Calibri" w:hAnsi="Calibri" w:cs="Arial"/>
-          <w:rtl/>
-          <w:sz w:val="24"/>
-          <w:szCs w:val="24"/>
-        </w:rPr>
-        <w:t xml:space="preserve">4.5. يوقّع نموذج الخروج ممثل مدير المستودعات وضمان الجودة والأمن، ويُسجَّل اسم السائق ورقم اللوحة. وإذا لم تتطابق بيانات المستند أو الكمية أو الختم، يوقف الخروج حتى يُحل الفرق.</w:t>
-      </w:r>
-    </w:p>
-    <w:p>
-      <w:pPr>
-        <w:pStyle w:val="ListeParagraf"/>
-        <w:bidi/>
-        <w:spacing w:after="80"/>
-        <w:ind w:left="0" w:right="709"/>
-        <w:jc w:val="both"/>
-      </w:pPr>
-    </w:p>
-    <w:p>
-      <w:pPr>
-        <w:pStyle w:val="ListeParagraf"/>
-        <w:bidi/>
-        <w:spacing w:before="120" w:after="60"/>
-        <w:ind w:left="0" w:right="709"/>
-      </w:pPr>
-      <w:r>
-        <w:rPr>
-          <w:rFonts w:ascii="Calibri" w:hAnsi="Calibri" w:cs="Arial"/>
-          <w:b/>
-          <w:bCs/>
-          <w:rtl/>
-          <w:sz w:val="24"/>
-          <w:szCs w:val="24"/>
-        </w:rPr>
-        <w:t xml:space="preserve">5. سجل الطلبية والدفعة واللوط (EMS.DP.TL.08.04)</w:t>
-      </w:r>
-    </w:p>
-    <w:p>
-      <w:pPr>
-        <w:pStyle w:val="ListeParagraf"/>
-        <w:bidi/>
-        <w:spacing w:after="80"/>
-        <w:ind w:left="0" w:right="709"/>
-        <w:jc w:val="both"/>
-      </w:pPr>
-      <w:r>
-        <w:rPr>
-          <w:rFonts w:ascii="Calibri" w:hAnsi="Calibri" w:cs="Arial"/>
-          <w:rtl/>
-          <w:sz w:val="24"/>
-          <w:szCs w:val="24"/>
-        </w:rPr>
-        <w:t xml:space="preserve">5.1. بعد الإرسال، سجل أرقام الطلبية والدفعة واللوط للبضاعة ونطاق الكراتين ورقم الختم ولوحة المركبة وتاريخ الإرسال وبيانات التسليم في سجل التتبع.</w:t>
-      </w:r>
-    </w:p>
-    <w:p>
-      <w:pPr>
-        <w:pStyle w:val="ListeParagraf"/>
-        <w:bidi/>
-        <w:spacing w:after="80"/>
-        <w:ind w:left="0" w:right="709"/>
-        <w:jc w:val="both"/>
-      </w:pPr>
-      <w:r>
-        <w:rPr>
-          <w:rFonts w:ascii="Calibri" w:hAnsi="Calibri" w:cs="Arial"/>
-          <w:rtl/>
-          <w:sz w:val="24"/>
-          <w:szCs w:val="24"/>
-        </w:rPr>
-        <w:t xml:space="preserve">5.2. أبقِ السجل مرتبطًا بقائمة التعبئة بحيث يمكن تتبع أي كرتونة للخلف إلى دفعة إنتاجها وللأمام إلى العميل؛ ويجب أن يكون التتبع للخلف عند طلب العميل ممكنًا خلال 4 ساعات (EMS.QA.PRO.02.08.).</w:t>
-      </w:r>
-    </w:p>
-    <w:p>
-      <w:pPr>
-        <w:pStyle w:val="ListeParagraf"/>
-        <w:bidi/>
-        <w:spacing w:after="80"/>
-        <w:ind w:left="0" w:right="709"/>
-        <w:jc w:val="both"/>
-      </w:pPr>
-      <w:r>
-        <w:rPr>
-          <w:rFonts w:ascii="Calibri" w:hAnsi="Calibri" w:cs="Arial"/>
-          <w:rtl/>
-          <w:sz w:val="24"/>
-          <w:szCs w:val="24"/>
-        </w:rPr>
-        <w:t xml:space="preserve">5.3. أرسل البضاعة وفق مبدأ الوارد أولًا يصرف أولًا ضمن الطلبية واللون نفسيهما ما لم يطلب العميل غير ذلك.</w:t>
-      </w:r>
-    </w:p>
-    <w:p>
-      <w:pPr>
-        <w:pStyle w:val="ListeParagraf"/>
-        <w:bidi/>
-        <w:spacing w:after="80"/>
-        <w:ind w:left="0" w:right="709"/>
-        <w:jc w:val="both"/>
-      </w:pPr>
-    </w:p>
-    <w:p>
-      <w:pPr>
-        <w:pStyle w:val="ListeParagraf"/>
-        <w:bidi/>
-        <w:spacing w:before="120" w:after="60"/>
-        <w:ind w:left="0" w:right="709"/>
-      </w:pPr>
-      <w:r>
-        <w:rPr>
-          <w:rFonts w:ascii="Calibri" w:hAnsi="Calibri" w:cs="Arial"/>
-          <w:b/>
-          <w:bCs/>
-          <w:rtl/>
-          <w:sz w:val="24"/>
-          <w:szCs w:val="24"/>
-        </w:rPr>
-        <w:t xml:space="preserve">6. الفحوص ومعايير القبول</w:t>
+        <w:t xml:space="preserve">EMS.QA.PRO.02.04. Seal Management Procedure</w:t>
       </w:r>
     </w:p>
     <w:p>
@@ -2806,18 +1574,16 @@
           <w:ilvl w:val="0"/>
           <w:numId w:val="1"/>
         </w:numPr>
-        <w:bidi/>
         <w:spacing w:after="60"/>
         <w:jc w:val="both"/>
       </w:pPr>
       <w:r>
         <w:rPr>
           <w:rFonts w:ascii="Calibri" w:hAnsi="Calibri" w:cs="Arial"/>
-          <w:rtl/>
-          <w:sz w:val="24"/>
-          <w:szCs w:val="24"/>
-        </w:rPr>
-        <w:t xml:space="preserve">علامات الكراتين وملصقاتها وأرقامها: مطابقة 100 % لتعليمات تعبئة العميل؛ والباركود مقروء بالماسح الضوئي.</w:t>
+          <w:sz w:val="24"/>
+          <w:szCs w:val="24"/>
+        </w:rPr>
+        <w:t xml:space="preserve">EMS.QA.PRO.02.08. Traceability and Product Recall Procedure</w:t>
       </w:r>
     </w:p>
     <w:p>
@@ -2827,18 +1593,16 @@
           <w:ilvl w:val="0"/>
           <w:numId w:val="1"/>
         </w:numPr>
-        <w:bidi/>
         <w:spacing w:after="60"/>
         <w:jc w:val="both"/>
       </w:pPr>
       <w:r>
         <w:rPr>
           <w:rFonts w:ascii="Calibri" w:hAnsi="Calibri" w:cs="Arial"/>
-          <w:rtl/>
-          <w:sz w:val="24"/>
-          <w:szCs w:val="24"/>
-        </w:rPr>
-        <w:t xml:space="preserve">قائمة التعبئة مقابل الكراتين: تطابق 100 % حسب الطلبية واللون والمقاس قبل الإفراج.</w:t>
+          <w:sz w:val="24"/>
+          <w:szCs w:val="24"/>
+        </w:rPr>
+        <w:t xml:space="preserve">EMS.İD.PRO.03.05. Container and Truck Loading Security Procedure</w:t>
       </w:r>
     </w:p>
     <w:p>
@@ -2848,18 +1612,16 @@
           <w:ilvl w:val="0"/>
           <w:numId w:val="1"/>
         </w:numPr>
-        <w:bidi/>
         <w:spacing w:after="60"/>
         <w:jc w:val="both"/>
       </w:pPr>
       <w:r>
         <w:rPr>
           <w:rFonts w:ascii="Calibri" w:hAnsi="Calibri" w:cs="Arial"/>
-          <w:rtl/>
-          <w:sz w:val="24"/>
-          <w:szCs w:val="24"/>
-        </w:rPr>
-        <w:t xml:space="preserve">سند التسليم وقائمة التعبئة وأمر الشحن: اتساق 100 %؛ ورقم الختم متطابق في جميع المستندات.</w:t>
+          <w:sz w:val="24"/>
+          <w:szCs w:val="24"/>
+        </w:rPr>
+        <w:t xml:space="preserve">EMS.KS.PRO.22.02. Nonconforming Product Control Procedure</w:t>
       </w:r>
     </w:p>
     <w:p>
@@ -2869,46 +1631,16 @@
           <w:ilvl w:val="0"/>
           <w:numId w:val="1"/>
         </w:numPr>
-        <w:bidi/>
         <w:spacing w:after="60"/>
         <w:jc w:val="both"/>
       </w:pPr>
       <w:r>
         <w:rPr>
           <w:rFonts w:ascii="Calibri" w:hAnsi="Calibri" w:cs="Arial"/>
-          <w:rtl/>
-          <w:sz w:val="24"/>
-          <w:szCs w:val="24"/>
-        </w:rPr>
-        <w:t xml:space="preserve">تُحدد الحدود والتسامحات في مواصفات العميل وسياسة الشركة؛ والقيم أعلاه أمثلة.</w:t>
-      </w:r>
-    </w:p>
-    <w:p>
-      <w:pPr>
-        <w:pStyle w:val="ListeParagraf"/>
-        <w:bidi/>
-        <w:spacing w:after="80"/>
-        <w:ind w:left="0" w:right="709"/>
-        <w:jc w:val="both"/>
-      </w:pPr>
-    </w:p>
-    <w:p>
-      <w:pPr>
-        <w:pStyle w:val="ListeParagraf"/>
-        <w:bidi/>
-        <w:spacing w:before="120" w:after="60"/>
-        <w:ind w:left="0" w:right="709"/>
-      </w:pPr>
-      <w:r>
-        <w:rPr>
-          <w:rFonts w:ascii="Calibri" w:hAnsi="Calibri" w:cs="Arial"/>
-          <w:b/>
-          <w:bCs/>
-          <w:rtl/>
-          <w:sz w:val="24"/>
-          <w:szCs w:val="24"/>
-        </w:rPr>
-        <w:t xml:space="preserve">7. المحظورات</w:t>
+          <w:sz w:val="24"/>
+          <w:szCs w:val="24"/>
+        </w:rPr>
+        <w:t xml:space="preserve">EMS.KS.PRO.22.03. Corrective and Preventive Action (CAPA) for Quality Problems Procedure</w:t>
       </w:r>
     </w:p>
     <w:p>
@@ -2918,18 +1650,16 @@
           <w:ilvl w:val="0"/>
           <w:numId w:val="1"/>
         </w:numPr>
-        <w:bidi/>
         <w:spacing w:after="60"/>
         <w:jc w:val="both"/>
       </w:pPr>
       <w:r>
         <w:rPr>
           <w:rFonts w:ascii="Calibri" w:hAnsi="Calibri" w:cs="Arial"/>
-          <w:rtl/>
-          <w:sz w:val="24"/>
-          <w:szCs w:val="24"/>
-        </w:rPr>
-        <w:t xml:space="preserve">لا تستخدم التصحيحات بخط اليد على علامات الكراتين أو الملصقات؛ استبدل الملصق أو الكرتونة.</w:t>
+          <w:sz w:val="24"/>
+          <w:szCs w:val="24"/>
+        </w:rPr>
+        <w:t xml:space="preserve">EMS.DP.FRM.08.04 Loading Control Form; EMS.DP.FRM.08.05 Dispatch Exit Form; EMS.DP.FRM.08.06 Traceability Record Form</w:t>
       </w:r>
     </w:p>
     <w:p>
@@ -2939,18 +1669,1316 @@
           <w:ilvl w:val="0"/>
           <w:numId w:val="1"/>
         </w:numPr>
-        <w:bidi/>
         <w:spacing w:after="60"/>
         <w:jc w:val="both"/>
       </w:pPr>
       <w:r>
         <w:rPr>
           <w:rFonts w:ascii="Calibri" w:hAnsi="Calibri" w:cs="Arial"/>
-          <w:rtl/>
-          <w:sz w:val="24"/>
-          <w:szCs w:val="24"/>
-        </w:rPr>
-        <w:t xml:space="preserve">لا تستخدم ملصقات طلبية أخرى أو مراجعات قديمة أو ملصقات تالفة.</w:t>
+          <w:sz w:val="24"/>
+          <w:szCs w:val="24"/>
+        </w:rPr>
+        <w:t xml:space="preserve">Customer Packing Instruction, Carton Mark Layout, Packing Lists, Delivery Notes, Seal Photos</w:t>
+      </w:r>
+    </w:p>
+    <w:p>
+      <w:pPr>
+        <w:pStyle w:val="ListeParagraf"/>
+        <w:spacing w:after="80"/>
+        <w:ind w:left="709" w:right="0"/>
+        <w:jc w:val="both"/>
+      </w:pPr>
+    </w:p>
+    <w:p>
+      <w:pPr>
+        <w:pStyle w:val="ListeParagraf"/>
+        <w:spacing w:before="120" w:after="60"/>
+        <w:ind w:left="709" w:right="0"/>
+      </w:pPr>
+      <w:r>
+        <w:rPr>
+          <w:rFonts w:ascii="Calibri" w:hAnsi="Calibri" w:cs="Arial"/>
+          <w:b/>
+          <w:bCs/>
+          <w:sz w:val="24"/>
+          <w:szCs w:val="24"/>
+        </w:rPr>
+        <w:t xml:space="preserve">10. FEEDBACK AND MONITORING</w:t>
+      </w:r>
+    </w:p>
+    <w:p>
+      <w:pPr>
+        <w:pStyle w:val="ListeParagraf"/>
+        <w:spacing w:after="80"/>
+        <w:ind w:left="709" w:right="0"/>
+        <w:jc w:val="both"/>
+      </w:pPr>
+      <w:r>
+        <w:rPr>
+          <w:rFonts w:ascii="Calibri" w:hAnsi="Calibri" w:cs="Arial"/>
+          <w:sz w:val="24"/>
+          <w:szCs w:val="24"/>
+        </w:rPr>
+        <w:t xml:space="preserve">The Warehouse Manager reviews labelling and packing list errors found in carton audits or reported by customers monthly, together with the KPIs: wrong or short shipments 0, dispatches stopped for seal or document mismatch 0, on-time shipping at least 98 % and backward tracing time of 4 hours or less. This instruction is reviewed every year.</w:t>
+      </w:r>
+    </w:p>
+    <w:p>
+      <w:r>
+        <w:br w:type="page"/>
+      </w:r>
+    </w:p>
+    <w:p>
+      <w:pPr>
+        <w:pStyle w:val="ListeParagraf"/>
+        <w:bidi/>
+        <w:spacing w:before="120" w:after="60"/>
+        <w:ind w:left="0" w:right="709"/>
+      </w:pPr>
+      <w:r>
+        <w:rPr>
+          <w:rFonts w:ascii="Calibri" w:hAnsi="Calibri" w:cs="Arial"/>
+          <w:b/>
+          <w:bCs/>
+          <w:rtl/>
+          <w:sz w:val="24"/>
+          <w:szCs w:val="24"/>
+        </w:rPr>
+        <w:t xml:space="preserve">الغرض</w:t>
+      </w:r>
+    </w:p>
+    <w:p>
+      <w:pPr>
+        <w:pStyle w:val="ListeParagraf"/>
+        <w:bidi/>
+        <w:spacing w:after="80"/>
+        <w:ind w:left="0" w:right="709"/>
+        <w:jc w:val="both"/>
+      </w:pPr>
+      <w:r>
+        <w:rPr>
+          <w:rFonts w:ascii="Calibri" w:hAnsi="Calibri" w:cs="Arial"/>
+          <w:rtl/>
+          <w:sz w:val="24"/>
+          <w:szCs w:val="24"/>
+        </w:rPr>
+        <w:t xml:space="preserve">توضح هذه التعليمات كيفية وضع العلامات والملصقات على كراتين التصدير، وكيفية وضع ملصق اللوط وتسجيله، وكيفية إعداد قائمة التعبئة وسند التسليم والتحقق منهما، وكيفية ختم الحمولة وتسجيل بيانات الطلبية والدفعة واللوط في شركة إيروغلو للتريكو (EMS)، بحيث يمكن تمييز كل كرتونة وتتبعها واستلامها من قبل العميل دون أخطاء. وهي تعليمات الخطوة 7 (التكرتن) من تدفق القسم في EMS.ÜR.PRO.05.10، وتليها الخطوة 8، الفحص النهائي (EMS.QA.PRO.02.14)، قبل التحميل. وتجمع تعليمات وضع علامات الكراتين السابقة مع تعليمات نظام الجودة السابقة بشأن سند التسليم وقائمة التعبئة والختم وسجل الطلبية والدفعة واللوط، وهي متسقة مع EMS.SO.PRO.23.07.</w:t>
+      </w:r>
+    </w:p>
+    <w:p>
+      <w:pPr>
+        <w:pStyle w:val="ListeParagraf"/>
+        <w:bidi/>
+        <w:spacing w:after="80"/>
+        <w:ind w:left="0" w:right="709"/>
+        <w:jc w:val="both"/>
+      </w:pPr>
+    </w:p>
+    <w:p>
+      <w:pPr>
+        <w:pStyle w:val="ListeParagraf"/>
+        <w:bidi/>
+        <w:spacing w:before="120" w:after="60"/>
+        <w:ind w:left="0" w:right="709"/>
+      </w:pPr>
+      <w:r>
+        <w:rPr>
+          <w:rFonts w:ascii="Calibri" w:hAnsi="Calibri" w:cs="Arial"/>
+          <w:b/>
+          <w:bCs/>
+          <w:rtl/>
+          <w:sz w:val="24"/>
+          <w:szCs w:val="24"/>
+        </w:rPr>
+        <w:t xml:space="preserve">النطاق</w:t>
+      </w:r>
+    </w:p>
+    <w:p>
+      <w:pPr>
+        <w:pStyle w:val="ListeParagraf"/>
+        <w:bidi/>
+        <w:spacing w:after="80"/>
+        <w:ind w:left="0" w:right="709"/>
+        <w:jc w:val="both"/>
+      </w:pPr>
+      <w:r>
+        <w:rPr>
+          <w:rFonts w:ascii="Calibri" w:hAnsi="Calibri" w:cs="Arial"/>
+          <w:rtl/>
+          <w:sz w:val="24"/>
+          <w:szCs w:val="24"/>
+        </w:rPr>
+        <w:t xml:space="preserve">تنطبق هذه التعليمات على جميع كراتين التصدير والسوق المحلي المعدة في قسم التعبئة ومستودع المنتجات التامة، وعلى قائمة التعبئة وسند التسليم الصادرين لكل شحنة، وعلى ختم المركبات والحاويات، وعلى سجل التتبع المحفوظ بعد الإرسال. أما خطوات التعبئة نفسها فموضحة في EMS.SO.PRO.23.07. وعملية الشحن في EMS.DP.PRO.08.02، والطي والتغليف بالأكياس في EMS.ÜR.TL.05.13، وترقيم اللوطات في EMS.ÜR.PRO.05.12 وEMS.ÜR.TL.05.14.</w:t>
+      </w:r>
+    </w:p>
+    <w:p>
+      <w:pPr>
+        <w:pStyle w:val="ListeParagraf"/>
+        <w:bidi/>
+        <w:spacing w:after="80"/>
+        <w:ind w:left="0" w:right="709"/>
+        <w:jc w:val="both"/>
+      </w:pPr>
+    </w:p>
+    <w:p>
+      <w:pPr>
+        <w:pStyle w:val="ListeParagraf"/>
+        <w:bidi/>
+        <w:spacing w:before="120" w:after="60"/>
+        <w:ind w:left="0" w:right="709"/>
+      </w:pPr>
+      <w:r>
+        <w:rPr>
+          <w:rFonts w:ascii="Calibri" w:hAnsi="Calibri" w:cs="Arial"/>
+          <w:b/>
+          <w:bCs/>
+          <w:rtl/>
+          <w:sz w:val="24"/>
+          <w:szCs w:val="24"/>
+        </w:rPr>
+        <w:t xml:space="preserve">المسؤوليات</w:t>
+      </w:r>
+    </w:p>
+    <w:p>
+      <w:pPr>
+        <w:pStyle w:val="ListeParagraf"/>
+        <w:bidi/>
+        <w:spacing w:after="80"/>
+        <w:ind w:left="0" w:right="709"/>
+        <w:jc w:val="both"/>
+      </w:pPr>
+      <w:r>
+        <w:rPr>
+          <w:rFonts w:ascii="Calibri" w:hAnsi="Calibri" w:cs="Arial"/>
+          <w:rtl/>
+          <w:sz w:val="24"/>
+          <w:szCs w:val="24"/>
+        </w:rPr>
+        <w:t xml:space="preserve">• </w:t>
+      </w:r>
+      <w:r>
+        <w:rPr>
+          <w:rFonts w:ascii="Calibri" w:hAnsi="Calibri" w:cs="Arial"/>
+          <w:b/>
+          <w:bCs/>
+          <w:rtl/>
+          <w:sz w:val="24"/>
+          <w:szCs w:val="24"/>
+        </w:rPr>
+        <w:t xml:space="preserve">مدير المستودعات:</w:t>
+      </w:r>
+      <w:r>
+        <w:rPr>
+          <w:rFonts w:ascii="Calibri" w:hAnsi="Calibri" w:cs="Arial"/>
+          <w:rtl/>
+          <w:sz w:val="24"/>
+          <w:szCs w:val="24"/>
+        </w:rPr>
+        <w:t xml:space="preserve"> يضمن تطبيق هذه التعليمات واعتماد قوائم التعبئة قبل التحميل والتصريح بأي تغيير بعد التحميل ومراجعة اتجاهات الأخطاء شهريًا.</w:t>
+      </w:r>
+    </w:p>
+    <w:p>
+      <w:pPr>
+        <w:pStyle w:val="ListeParagraf"/>
+        <w:bidi/>
+        <w:spacing w:after="80"/>
+        <w:ind w:left="0" w:right="709"/>
+        <w:jc w:val="both"/>
+      </w:pPr>
+      <w:r>
+        <w:rPr>
+          <w:rFonts w:ascii="Calibri" w:hAnsi="Calibri" w:cs="Arial"/>
+          <w:rtl/>
+          <w:sz w:val="24"/>
+          <w:szCs w:val="24"/>
+        </w:rPr>
+        <w:t xml:space="preserve">• </w:t>
+      </w:r>
+      <w:r>
+        <w:rPr>
+          <w:rFonts w:ascii="Calibri" w:hAnsi="Calibri" w:cs="Arial"/>
+          <w:b/>
+          <w:bCs/>
+          <w:rtl/>
+          <w:sz w:val="24"/>
+          <w:szCs w:val="24"/>
+        </w:rPr>
+        <w:t xml:space="preserve">مشرف التعبئة:</w:t>
+      </w:r>
+      <w:r>
+        <w:rPr>
+          <w:rFonts w:ascii="Calibri" w:hAnsi="Calibri" w:cs="Arial"/>
+          <w:rtl/>
+          <w:sz w:val="24"/>
+          <w:szCs w:val="24"/>
+        </w:rPr>
+        <w:t xml:space="preserve"> يتأكد من استخدام العلامات والملصقات وأرقام الكراتين الصحيحة والمعتمدة لكل طلبية، ومن اعتماد أول كرتونة في كل طلبية قبل بدء التعبئة الكمية.</w:t>
+      </w:r>
+    </w:p>
+    <w:p>
+      <w:pPr>
+        <w:pStyle w:val="ListeParagraf"/>
+        <w:bidi/>
+        <w:spacing w:after="80"/>
+        <w:ind w:left="0" w:right="709"/>
+        <w:jc w:val="both"/>
+      </w:pPr>
+      <w:r>
+        <w:rPr>
+          <w:rFonts w:ascii="Calibri" w:hAnsi="Calibri" w:cs="Arial"/>
+          <w:rtl/>
+          <w:sz w:val="24"/>
+          <w:szCs w:val="24"/>
+        </w:rPr>
+        <w:t xml:space="preserve">• </w:t>
+      </w:r>
+      <w:r>
+        <w:rPr>
+          <w:rFonts w:ascii="Calibri" w:hAnsi="Calibri" w:cs="Arial"/>
+          <w:b/>
+          <w:bCs/>
+          <w:rtl/>
+          <w:sz w:val="24"/>
+          <w:szCs w:val="24"/>
+        </w:rPr>
+        <w:t xml:space="preserve">عمال التعبئة / وضع الملصقات:</w:t>
+      </w:r>
+      <w:r>
+        <w:rPr>
+          <w:rFonts w:ascii="Calibri" w:hAnsi="Calibri" w:cs="Arial"/>
+          <w:rtl/>
+          <w:sz w:val="24"/>
+          <w:szCs w:val="24"/>
+        </w:rPr>
+        <w:t xml:space="preserve"> يضعون العلامات والملصقات وفق هذه التعليمات وتعليمات التعبئة الخاصة بالعميل.</w:t>
+      </w:r>
+    </w:p>
+    <w:p>
+      <w:pPr>
+        <w:pStyle w:val="ListeParagraf"/>
+        <w:bidi/>
+        <w:spacing w:after="80"/>
+        <w:ind w:left="0" w:right="709"/>
+        <w:jc w:val="both"/>
+      </w:pPr>
+      <w:r>
+        <w:rPr>
+          <w:rFonts w:ascii="Calibri" w:hAnsi="Calibri" w:cs="Arial"/>
+          <w:rtl/>
+          <w:sz w:val="24"/>
+          <w:szCs w:val="24"/>
+        </w:rPr>
+        <w:t xml:space="preserve">• </w:t>
+      </w:r>
+      <w:r>
+        <w:rPr>
+          <w:rFonts w:ascii="Calibri" w:hAnsi="Calibri" w:cs="Arial"/>
+          <w:b/>
+          <w:bCs/>
+          <w:rtl/>
+          <w:sz w:val="24"/>
+          <w:szCs w:val="24"/>
+        </w:rPr>
+        <w:t xml:space="preserve">موظف الشحن:</w:t>
+      </w:r>
+      <w:r>
+        <w:rPr>
+          <w:rFonts w:ascii="Calibri" w:hAnsi="Calibri" w:cs="Arial"/>
+          <w:rtl/>
+          <w:sz w:val="24"/>
+          <w:szCs w:val="24"/>
+        </w:rPr>
+        <w:t xml:space="preserve"> يعد قائمة التعبئة وسند التسليم ويطابقهما مع الكراتين الفعلية قبل التحميل، ويضع الختم، ويستكمل سجلات الإرسال والتتبع.</w:t>
+      </w:r>
+    </w:p>
+    <w:p>
+      <w:pPr>
+        <w:pStyle w:val="ListeParagraf"/>
+        <w:bidi/>
+        <w:spacing w:after="80"/>
+        <w:ind w:left="0" w:right="709"/>
+        <w:jc w:val="both"/>
+      </w:pPr>
+      <w:r>
+        <w:rPr>
+          <w:rFonts w:ascii="Calibri" w:hAnsi="Calibri" w:cs="Arial"/>
+          <w:rtl/>
+          <w:sz w:val="24"/>
+          <w:szCs w:val="24"/>
+        </w:rPr>
+        <w:t xml:space="preserve">• </w:t>
+      </w:r>
+      <w:r>
+        <w:rPr>
+          <w:rFonts w:ascii="Calibri" w:hAnsi="Calibri" w:cs="Arial"/>
+          <w:b/>
+          <w:bCs/>
+          <w:rtl/>
+          <w:sz w:val="24"/>
+          <w:szCs w:val="24"/>
+        </w:rPr>
+        <w:t xml:space="preserve">ضمان الجودة:</w:t>
+      </w:r>
+      <w:r>
+        <w:rPr>
+          <w:rFonts w:ascii="Calibri" w:hAnsi="Calibri" w:cs="Arial"/>
+          <w:rtl/>
+          <w:sz w:val="24"/>
+          <w:szCs w:val="24"/>
+        </w:rPr>
+        <w:t xml:space="preserve"> يفحص العلامات والملصقات وقائمة التعبئة أثناء تدقيق الكراتين، ويتحقق من حالة الإفراج عن البضاعة، ويحتفظ بسجل التتبع.</w:t>
+      </w:r>
+    </w:p>
+    <w:p>
+      <w:pPr>
+        <w:pStyle w:val="ListeParagraf"/>
+        <w:bidi/>
+        <w:spacing w:after="80"/>
+        <w:ind w:left="0" w:right="709"/>
+        <w:jc w:val="both"/>
+      </w:pPr>
+      <w:r>
+        <w:rPr>
+          <w:rFonts w:ascii="Calibri" w:hAnsi="Calibri" w:cs="Arial"/>
+          <w:rtl/>
+          <w:sz w:val="24"/>
+          <w:szCs w:val="24"/>
+        </w:rPr>
+        <w:t xml:space="preserve">• </w:t>
+      </w:r>
+      <w:r>
+        <w:rPr>
+          <w:rFonts w:ascii="Calibri" w:hAnsi="Calibri" w:cs="Arial"/>
+          <w:b/>
+          <w:bCs/>
+          <w:rtl/>
+          <w:sz w:val="24"/>
+          <w:szCs w:val="24"/>
+        </w:rPr>
+        <w:t xml:space="preserve">الأمن:</w:t>
+      </w:r>
+      <w:r>
+        <w:rPr>
+          <w:rFonts w:ascii="Calibri" w:hAnsi="Calibri" w:cs="Arial"/>
+          <w:rtl/>
+          <w:sz w:val="24"/>
+          <w:szCs w:val="24"/>
+        </w:rPr>
+        <w:t xml:space="preserve"> يفحص المستندات والمركبة ورقم الختم عند البوابة ويوقف الخروج عند عدم التطابق.</w:t>
+      </w:r>
+    </w:p>
+    <w:p>
+      <w:pPr>
+        <w:pStyle w:val="ListeParagraf"/>
+        <w:bidi/>
+        <w:spacing w:after="80"/>
+        <w:ind w:left="0" w:right="709"/>
+        <w:jc w:val="both"/>
+      </w:pPr>
+      <w:r>
+        <w:rPr>
+          <w:rFonts w:ascii="Calibri" w:hAnsi="Calibri" w:cs="Arial"/>
+          <w:rtl/>
+          <w:sz w:val="24"/>
+          <w:szCs w:val="24"/>
+        </w:rPr>
+        <w:t xml:space="preserve">• </w:t>
+      </w:r>
+      <w:r>
+        <w:rPr>
+          <w:rFonts w:ascii="Calibri" w:hAnsi="Calibri" w:cs="Arial"/>
+          <w:b/>
+          <w:bCs/>
+          <w:rtl/>
+          <w:sz w:val="24"/>
+          <w:szCs w:val="24"/>
+        </w:rPr>
+        <w:t xml:space="preserve">الميرشندايزينغ:</w:t>
+      </w:r>
+      <w:r>
+        <w:rPr>
+          <w:rFonts w:ascii="Calibri" w:hAnsi="Calibri" w:cs="Arial"/>
+          <w:rtl/>
+          <w:sz w:val="24"/>
+          <w:szCs w:val="24"/>
+        </w:rPr>
+        <w:t xml:space="preserve"> يوفر تعليمات التعبئة المعتمدة من العميل وتصميم علامات الكراتين وتوزيع المقاسات، ويستلم قائمة التعبئة النهائية.</w:t>
+      </w:r>
+    </w:p>
+    <w:p>
+      <w:pPr>
+        <w:pStyle w:val="ListeParagraf"/>
+        <w:bidi/>
+        <w:spacing w:after="80"/>
+        <w:ind w:left="0" w:right="709"/>
+        <w:jc w:val="both"/>
+      </w:pPr>
+      <w:r>
+        <w:rPr>
+          <w:rFonts w:ascii="Calibri" w:hAnsi="Calibri" w:cs="Arial"/>
+          <w:rtl/>
+          <w:sz w:val="24"/>
+          <w:szCs w:val="24"/>
+        </w:rPr>
+        <w:t xml:space="preserve">• </w:t>
+      </w:r>
+      <w:r>
+        <w:rPr>
+          <w:rFonts w:ascii="Calibri" w:hAnsi="Calibri" w:cs="Arial"/>
+          <w:b/>
+          <w:bCs/>
+          <w:rtl/>
+          <w:sz w:val="24"/>
+          <w:szCs w:val="24"/>
+        </w:rPr>
+        <w:t xml:space="preserve">مدير المصنع:</w:t>
+      </w:r>
+      <w:r>
+        <w:rPr>
+          <w:rFonts w:ascii="Calibri" w:hAnsi="Calibri" w:cs="Arial"/>
+          <w:rtl/>
+          <w:sz w:val="24"/>
+          <w:szCs w:val="24"/>
+        </w:rPr>
+        <w:t xml:space="preserve"> يراجع أخطاء الشحن ويعتمد الاستثناءات.</w:t>
+      </w:r>
+    </w:p>
+    <w:p>
+      <w:pPr>
+        <w:pStyle w:val="ListeParagraf"/>
+        <w:bidi/>
+        <w:spacing w:after="80"/>
+        <w:ind w:left="0" w:right="709"/>
+        <w:jc w:val="both"/>
+      </w:pPr>
+    </w:p>
+    <w:p>
+      <w:pPr>
+        <w:pStyle w:val="ListeParagraf"/>
+        <w:bidi/>
+        <w:spacing w:before="120" w:after="60"/>
+        <w:ind w:left="0" w:right="709"/>
+      </w:pPr>
+      <w:r>
+        <w:rPr>
+          <w:rFonts w:ascii="Calibri" w:hAnsi="Calibri" w:cs="Arial"/>
+          <w:b/>
+          <w:bCs/>
+          <w:rtl/>
+          <w:sz w:val="24"/>
+          <w:szCs w:val="24"/>
+        </w:rPr>
+        <w:t xml:space="preserve">التعريفات</w:t>
+      </w:r>
+    </w:p>
+    <w:p>
+      <w:pPr>
+        <w:pStyle w:val="ListeParagraf"/>
+        <w:bidi/>
+        <w:spacing w:after="80"/>
+        <w:ind w:left="0" w:right="709"/>
+        <w:jc w:val="both"/>
+      </w:pPr>
+      <w:r>
+        <w:rPr>
+          <w:rFonts w:ascii="Calibri" w:hAnsi="Calibri" w:cs="Arial"/>
+          <w:rtl/>
+          <w:sz w:val="24"/>
+          <w:szCs w:val="24"/>
+        </w:rPr>
+        <w:t xml:space="preserve">• </w:t>
+      </w:r>
+      <w:r>
+        <w:rPr>
+          <w:rFonts w:ascii="Calibri" w:hAnsi="Calibri" w:cs="Arial"/>
+          <w:b/>
+          <w:bCs/>
+          <w:rtl/>
+          <w:sz w:val="24"/>
+          <w:szCs w:val="24"/>
+        </w:rPr>
+        <w:t xml:space="preserve">العلامة الرئيسية / الجانبية:</w:t>
+      </w:r>
+      <w:r>
+        <w:rPr>
+          <w:rFonts w:ascii="Calibri" w:hAnsi="Calibri" w:cs="Arial"/>
+          <w:rtl/>
+          <w:sz w:val="24"/>
+          <w:szCs w:val="24"/>
+        </w:rPr>
+        <w:t xml:space="preserve"> بيانات الشحن المطبوعة أو الملصقة على الجانبين الطويل والقصير للكرتونة حسب متطلبات العميل.</w:t>
+      </w:r>
+    </w:p>
+    <w:p>
+      <w:pPr>
+        <w:pStyle w:val="ListeParagraf"/>
+        <w:bidi/>
+        <w:spacing w:after="80"/>
+        <w:ind w:left="0" w:right="709"/>
+        <w:jc w:val="both"/>
+      </w:pPr>
+      <w:r>
+        <w:rPr>
+          <w:rFonts w:ascii="Calibri" w:hAnsi="Calibri" w:cs="Arial"/>
+          <w:rtl/>
+          <w:sz w:val="24"/>
+          <w:szCs w:val="24"/>
+        </w:rPr>
+        <w:t xml:space="preserve">• </w:t>
+      </w:r>
+      <w:r>
+        <w:rPr>
+          <w:rFonts w:ascii="Calibri" w:hAnsi="Calibri" w:cs="Arial"/>
+          <w:b/>
+          <w:bCs/>
+          <w:rtl/>
+          <w:sz w:val="24"/>
+          <w:szCs w:val="24"/>
+        </w:rPr>
+        <w:t xml:space="preserve">ملصق الكرتونة (SSCC / ملصق الباركود):</w:t>
+      </w:r>
+      <w:r>
+        <w:rPr>
+          <w:rFonts w:ascii="Calibri" w:hAnsi="Calibri" w:cs="Arial"/>
+          <w:rtl/>
+          <w:sz w:val="24"/>
+          <w:szCs w:val="24"/>
+        </w:rPr>
+        <w:t xml:space="preserve"> ملصق العميل الذي يحمل باركودًا فريدًا لكل كرتونة ومرتبطًا بقائمة التعبئة.</w:t>
+      </w:r>
+    </w:p>
+    <w:p>
+      <w:pPr>
+        <w:pStyle w:val="ListeParagraf"/>
+        <w:bidi/>
+        <w:spacing w:after="80"/>
+        <w:ind w:left="0" w:right="709"/>
+        <w:jc w:val="both"/>
+      </w:pPr>
+      <w:r>
+        <w:rPr>
+          <w:rFonts w:ascii="Calibri" w:hAnsi="Calibri" w:cs="Arial"/>
+          <w:rtl/>
+          <w:sz w:val="24"/>
+          <w:szCs w:val="24"/>
+        </w:rPr>
+        <w:t xml:space="preserve">• </w:t>
+      </w:r>
+      <w:r>
+        <w:rPr>
+          <w:rFonts w:ascii="Calibri" w:hAnsi="Calibri" w:cs="Arial"/>
+          <w:b/>
+          <w:bCs/>
+          <w:rtl/>
+          <w:sz w:val="24"/>
+          <w:szCs w:val="24"/>
+        </w:rPr>
+        <w:t xml:space="preserve">قائمة التعبئة:</w:t>
+      </w:r>
+      <w:r>
+        <w:rPr>
+          <w:rFonts w:ascii="Calibri" w:hAnsi="Calibri" w:cs="Arial"/>
+          <w:rtl/>
+          <w:sz w:val="24"/>
+          <w:szCs w:val="24"/>
+        </w:rPr>
+        <w:t xml:space="preserve"> مستند الشحن الذي يبين رقم كل كرتونة والموديل واللون وتوزيع المقاسات والكمية والوزن والأبعاد.</w:t>
+      </w:r>
+    </w:p>
+    <w:p>
+      <w:pPr>
+        <w:pStyle w:val="ListeParagraf"/>
+        <w:bidi/>
+        <w:spacing w:after="80"/>
+        <w:ind w:left="0" w:right="709"/>
+        <w:jc w:val="both"/>
+      </w:pPr>
+      <w:r>
+        <w:rPr>
+          <w:rFonts w:ascii="Calibri" w:hAnsi="Calibri" w:cs="Arial"/>
+          <w:rtl/>
+          <w:sz w:val="24"/>
+          <w:szCs w:val="24"/>
+        </w:rPr>
+        <w:t xml:space="preserve">• </w:t>
+      </w:r>
+      <w:r>
+        <w:rPr>
+          <w:rFonts w:ascii="Calibri" w:hAnsi="Calibri" w:cs="Arial"/>
+          <w:b/>
+          <w:bCs/>
+          <w:rtl/>
+          <w:sz w:val="24"/>
+          <w:szCs w:val="24"/>
+        </w:rPr>
+        <w:t xml:space="preserve">سند التسليم:</w:t>
+      </w:r>
+      <w:r>
+        <w:rPr>
+          <w:rFonts w:ascii="Calibri" w:hAnsi="Calibri" w:cs="Arial"/>
+          <w:rtl/>
+          <w:sz w:val="24"/>
+          <w:szCs w:val="24"/>
+        </w:rPr>
+        <w:t xml:space="preserve"> المستند الذي يثبت خروج البضاعة من المصنع.</w:t>
+      </w:r>
+    </w:p>
+    <w:p>
+      <w:pPr>
+        <w:pStyle w:val="ListeParagraf"/>
+        <w:bidi/>
+        <w:spacing w:after="80"/>
+        <w:ind w:left="0" w:right="709"/>
+        <w:jc w:val="both"/>
+      </w:pPr>
+      <w:r>
+        <w:rPr>
+          <w:rFonts w:ascii="Calibri" w:hAnsi="Calibri" w:cs="Arial"/>
+          <w:rtl/>
+          <w:sz w:val="24"/>
+          <w:szCs w:val="24"/>
+        </w:rPr>
+        <w:t xml:space="preserve">• </w:t>
+      </w:r>
+      <w:r>
+        <w:rPr>
+          <w:rFonts w:ascii="Calibri" w:hAnsi="Calibri" w:cs="Arial"/>
+          <w:b/>
+          <w:bCs/>
+          <w:rtl/>
+          <w:sz w:val="24"/>
+          <w:szCs w:val="24"/>
+        </w:rPr>
+        <w:t xml:space="preserve">الختم:</w:t>
+      </w:r>
+      <w:r>
+        <w:rPr>
+          <w:rFonts w:ascii="Calibri" w:hAnsi="Calibri" w:cs="Arial"/>
+          <w:rtl/>
+          <w:sz w:val="24"/>
+          <w:szCs w:val="24"/>
+        </w:rPr>
+        <w:t xml:space="preserve"> إغلاق مرقم يدل على العبث، يوضع على المركبة أو الحاوية بعد التحميل (ISO 17712 للأختام المسمارية عالية الأمان).</w:t>
+      </w:r>
+    </w:p>
+    <w:p>
+      <w:pPr>
+        <w:pStyle w:val="ListeParagraf"/>
+        <w:bidi/>
+        <w:spacing w:after="80"/>
+        <w:ind w:left="0" w:right="709"/>
+        <w:jc w:val="both"/>
+      </w:pPr>
+      <w:r>
+        <w:rPr>
+          <w:rFonts w:ascii="Calibri" w:hAnsi="Calibri" w:cs="Arial"/>
+          <w:rtl/>
+          <w:sz w:val="24"/>
+          <w:szCs w:val="24"/>
+        </w:rPr>
+        <w:t xml:space="preserve">• </w:t>
+      </w:r>
+      <w:r>
+        <w:rPr>
+          <w:rFonts w:ascii="Calibri" w:hAnsi="Calibri" w:cs="Arial"/>
+          <w:b/>
+          <w:bCs/>
+          <w:rtl/>
+          <w:sz w:val="24"/>
+          <w:szCs w:val="24"/>
+        </w:rPr>
+        <w:t xml:space="preserve">سجل الطلبية والدفعة واللوط:</w:t>
+      </w:r>
+      <w:r>
+        <w:rPr>
+          <w:rFonts w:ascii="Calibri" w:hAnsi="Calibri" w:cs="Arial"/>
+          <w:rtl/>
+          <w:sz w:val="24"/>
+          <w:szCs w:val="24"/>
+        </w:rPr>
+        <w:t xml:space="preserve"> السجل الذي يربط كل شحنة بالطلبية ودفعة الإنتاج واللوط بحيث يمكن تتبع البضاعة للخلف وللأمام.</w:t>
+      </w:r>
+    </w:p>
+    <w:p>
+      <w:pPr>
+        <w:pStyle w:val="ListeParagraf"/>
+        <w:bidi/>
+        <w:spacing w:after="80"/>
+        <w:ind w:left="0" w:right="709"/>
+        <w:jc w:val="both"/>
+      </w:pPr>
+    </w:p>
+    <w:p>
+      <w:pPr>
+        <w:pStyle w:val="ListeParagraf"/>
+        <w:bidi/>
+        <w:spacing w:before="120" w:after="60"/>
+        <w:ind w:left="0" w:right="709"/>
+      </w:pPr>
+      <w:r>
+        <w:rPr>
+          <w:rFonts w:ascii="Calibri" w:hAnsi="Calibri" w:cs="Arial"/>
+          <w:b/>
+          <w:bCs/>
+          <w:rtl/>
+          <w:sz w:val="24"/>
+          <w:szCs w:val="24"/>
+        </w:rPr>
+        <w:t xml:space="preserve">التعليمات</w:t>
+      </w:r>
+    </w:p>
+    <w:p>
+      <w:pPr>
+        <w:pStyle w:val="ListeParagraf"/>
+        <w:bidi/>
+        <w:spacing w:before="120" w:after="60"/>
+        <w:ind w:left="0" w:right="709"/>
+      </w:pPr>
+      <w:r>
+        <w:rPr>
+          <w:rFonts w:ascii="Calibri" w:hAnsi="Calibri" w:cs="Arial"/>
+          <w:b/>
+          <w:bCs/>
+          <w:rtl/>
+          <w:sz w:val="24"/>
+          <w:szCs w:val="24"/>
+        </w:rPr>
+        <w:t xml:space="preserve">1. قبل البدء</w:t>
+      </w:r>
+    </w:p>
+    <w:p>
+      <w:pPr>
+        <w:pStyle w:val="ListeParagraf"/>
+        <w:bidi/>
+        <w:spacing w:after="80"/>
+        <w:ind w:left="0" w:right="709"/>
+        <w:jc w:val="both"/>
+      </w:pPr>
+      <w:r>
+        <w:rPr>
+          <w:rFonts w:ascii="Calibri" w:hAnsi="Calibri" w:cs="Arial"/>
+          <w:rtl/>
+          <w:sz w:val="24"/>
+          <w:szCs w:val="24"/>
+        </w:rPr>
+        <w:t xml:space="preserve">1.1. احصل من قسم الميرشندايزينغ على أحدث تعليمات تعبئة معتمدة من العميل وتصميم علامات الكراتين وملف الملصقات وتوزيع مقاسات الطلبية، وتحقق من تاريخ المراجعة.</w:t>
+      </w:r>
+    </w:p>
+    <w:p>
+      <w:pPr>
+        <w:pStyle w:val="ListeParagraf"/>
+        <w:bidi/>
+        <w:spacing w:after="80"/>
+        <w:ind w:left="0" w:right="709"/>
+        <w:jc w:val="both"/>
+      </w:pPr>
+      <w:r>
+        <w:rPr>
+          <w:rFonts w:ascii="Calibri" w:hAnsi="Calibri" w:cs="Arial"/>
+          <w:rtl/>
+          <w:sz w:val="24"/>
+          <w:szCs w:val="24"/>
+        </w:rPr>
+        <w:t xml:space="preserve">1.2. اطبع ملصقًا تجريبيًا وتحقق من قراءة الباركود بالماسح الضوئي، وتأكد من صحة رقم الطلبية والموديل واللون والمقاس والكمية.</w:t>
+      </w:r>
+    </w:p>
+    <w:p>
+      <w:pPr>
+        <w:pStyle w:val="ListeParagraf"/>
+        <w:bidi/>
+        <w:spacing w:after="80"/>
+        <w:ind w:left="0" w:right="709"/>
+        <w:jc w:val="both"/>
+      </w:pPr>
+      <w:r>
+        <w:rPr>
+          <w:rFonts w:ascii="Calibri" w:hAnsi="Calibri" w:cs="Arial"/>
+          <w:rtl/>
+          <w:sz w:val="24"/>
+          <w:szCs w:val="24"/>
+        </w:rPr>
+        <w:t xml:space="preserve">1.3. احتفظ على طاولة التعبئة بملصقات وعلامات طلبية واحدة فقط في كل مرة.</w:t>
+      </w:r>
+    </w:p>
+    <w:p>
+      <w:pPr>
+        <w:pStyle w:val="ListeParagraf"/>
+        <w:bidi/>
+        <w:spacing w:after="80"/>
+        <w:ind w:left="0" w:right="709"/>
+        <w:jc w:val="both"/>
+      </w:pPr>
+      <w:r>
+        <w:rPr>
+          <w:rFonts w:ascii="Calibri" w:hAnsi="Calibri" w:cs="Arial"/>
+          <w:rtl/>
+          <w:sz w:val="24"/>
+          <w:szCs w:val="24"/>
+        </w:rPr>
+        <w:t xml:space="preserve">1.4. تأكد من أن البضاعة المراد تكرتنها تأتي من لوط اكتملت سجلاته: مراقبة الجودة والكي والفحص البصري وسجل كاشف المعادن (EMS.QA.FRM.03.07) وملصق اللوط (EMS.ÜR.FRM.05.10)؛ ولا تعبئ بضاعة موقوفة أو دون سجل كاشف. ويصدر الإفراج عن اللوط من الفحص النهائي (الخطوة 8) ويُتحقق منه مرة أخرى قبل التحميل.</w:t>
+      </w:r>
+    </w:p>
+    <w:p>
+      <w:pPr>
+        <w:pStyle w:val="ListeParagraf"/>
+        <w:bidi/>
+        <w:spacing w:after="80"/>
+        <w:ind w:left="0" w:right="709"/>
+        <w:jc w:val="both"/>
+      </w:pPr>
+    </w:p>
+    <w:p>
+      <w:pPr>
+        <w:pStyle w:val="ListeParagraf"/>
+        <w:bidi/>
+        <w:spacing w:before="120" w:after="60"/>
+        <w:ind w:left="0" w:right="709"/>
+      </w:pPr>
+      <w:r>
+        <w:rPr>
+          <w:rFonts w:ascii="Calibri" w:hAnsi="Calibri" w:cs="Arial"/>
+          <w:b/>
+          <w:bCs/>
+          <w:rtl/>
+          <w:sz w:val="24"/>
+          <w:szCs w:val="24"/>
+        </w:rPr>
+        <w:t xml:space="preserve">2. وضع العلامات والملصقات</w:t>
+      </w:r>
+    </w:p>
+    <w:p>
+      <w:pPr>
+        <w:pStyle w:val="ListeParagraf"/>
+        <w:bidi/>
+        <w:spacing w:after="80"/>
+        <w:ind w:left="0" w:right="709"/>
+        <w:jc w:val="both"/>
+      </w:pPr>
+      <w:r>
+        <w:rPr>
+          <w:rFonts w:ascii="Calibri" w:hAnsi="Calibri" w:cs="Arial"/>
+          <w:rtl/>
+          <w:sz w:val="24"/>
+          <w:szCs w:val="24"/>
+        </w:rPr>
+        <w:t xml:space="preserve">2.1. اكتب أو اطبع على كل كرتونة على الأقل: رقم طلبية العميل والموديل واللون والمقاس أو التشكيلة والكمية ورقم الكرتونة (مثل 1/250) ورقم اللوط والوزن الصافي والإجمالي وأبعاد الكرتونة وعبارة «صُنع في مصر» (Made in Egypt).</w:t>
+      </w:r>
+    </w:p>
+    <w:p>
+      <w:pPr>
+        <w:pStyle w:val="ListeParagraf"/>
+        <w:bidi/>
+        <w:spacing w:after="80"/>
+        <w:ind w:left="0" w:right="709"/>
+        <w:jc w:val="both"/>
+      </w:pPr>
+      <w:r>
+        <w:rPr>
+          <w:rFonts w:ascii="Calibri" w:hAnsi="Calibri" w:cs="Arial"/>
+          <w:rtl/>
+          <w:sz w:val="24"/>
+          <w:szCs w:val="24"/>
+        </w:rPr>
+        <w:t xml:space="preserve">2.2. ضع ملصقات الباركود مستوية ومستقيمة وفي الموضع الذي يحدده العميل؛ ولا تضعها أبدًا فوق خط لصق أو شريط أو حافة.</w:t>
+      </w:r>
+    </w:p>
+    <w:p>
+      <w:pPr>
+        <w:pStyle w:val="ListeParagraf"/>
+        <w:bidi/>
+        <w:spacing w:after="80"/>
+        <w:ind w:left="0" w:right="709"/>
+        <w:jc w:val="both"/>
+      </w:pPr>
+      <w:r>
+        <w:rPr>
+          <w:rFonts w:ascii="Calibri" w:hAnsi="Calibri" w:cs="Arial"/>
+          <w:rtl/>
+          <w:sz w:val="24"/>
+          <w:szCs w:val="24"/>
+        </w:rPr>
+        <w:t xml:space="preserve">2.3. أضف علامات المناولة والمحتوى (مثل ادعاء GRS/RCS أو OCS، قابل للكسر، هذا الجانب للأعلى) فقط عند طلبها واعتمادها.</w:t>
+      </w:r>
+    </w:p>
+    <w:p>
+      <w:pPr>
+        <w:pStyle w:val="ListeParagraf"/>
+        <w:bidi/>
+        <w:spacing w:after="80"/>
+        <w:ind w:left="0" w:right="709"/>
+        <w:jc w:val="both"/>
+      </w:pPr>
+      <w:r>
+        <w:rPr>
+          <w:rFonts w:ascii="Calibri" w:hAnsi="Calibri" w:cs="Arial"/>
+          <w:rtl/>
+          <w:sz w:val="24"/>
+          <w:szCs w:val="24"/>
+        </w:rPr>
+        <w:t xml:space="preserve">2.4. أعطِ أرقام الكراتين بتسلسل متصل لكل طلبية، ولا تكرر أي رقم أو تتخطاه، وسجل الأرقام الملغاة.</w:t>
+      </w:r>
+    </w:p>
+    <w:p>
+      <w:pPr>
+        <w:pStyle w:val="ListeParagraf"/>
+        <w:bidi/>
+        <w:spacing w:after="80"/>
+        <w:ind w:left="0" w:right="709"/>
+        <w:jc w:val="both"/>
+      </w:pPr>
+      <w:r>
+        <w:rPr>
+          <w:rFonts w:ascii="Calibri" w:hAnsi="Calibri" w:cs="Arial"/>
+          <w:rtl/>
+          <w:sz w:val="24"/>
+          <w:szCs w:val="24"/>
+        </w:rPr>
+        <w:t xml:space="preserve">2.5. ألصق ملصق اللوط المعد وفق EMS.ÜR.TL.05.14 على الكرتونة في الموضع المحدد فيه؛ ويجب أن يتطابق رقم اللوط على الملصق والكرتونة وقائمة التعبئة. وسجل أرقام الكراتين ورقم اللوط في نموذج مراقبة ترتيب الكراتين وقائمة التعبئة (EMS.ÜR.FRM.05.11).</w:t>
+      </w:r>
+    </w:p>
+    <w:p>
+      <w:pPr>
+        <w:pStyle w:val="ListeParagraf"/>
+        <w:bidi/>
+        <w:spacing w:after="80"/>
+        <w:ind w:left="0" w:right="709"/>
+        <w:jc w:val="both"/>
+      </w:pPr>
+      <w:r>
+        <w:rPr>
+          <w:rFonts w:ascii="Calibri" w:hAnsi="Calibri" w:cs="Arial"/>
+          <w:rtl/>
+          <w:sz w:val="24"/>
+          <w:szCs w:val="24"/>
+        </w:rPr>
+        <w:t xml:space="preserve">2.6. يعتمد مشرف التعبئة وضمان الجودة أول كرتونة معبأة في كل طلبية (العلامات والملصقات والمحتوى والوزن) قبل استمرار التعبئة الكمية.</w:t>
+      </w:r>
+    </w:p>
+    <w:p>
+      <w:pPr>
+        <w:pStyle w:val="ListeParagraf"/>
+        <w:bidi/>
+        <w:spacing w:after="80"/>
+        <w:ind w:left="0" w:right="709"/>
+        <w:jc w:val="both"/>
+      </w:pPr>
+    </w:p>
+    <w:p>
+      <w:pPr>
+        <w:pStyle w:val="ListeParagraf"/>
+        <w:bidi/>
+        <w:spacing w:before="120" w:after="60"/>
+        <w:ind w:left="0" w:right="709"/>
+      </w:pPr>
+      <w:r>
+        <w:rPr>
+          <w:rFonts w:ascii="Calibri" w:hAnsi="Calibri" w:cs="Arial"/>
+          <w:b/>
+          <w:bCs/>
+          <w:rtl/>
+          <w:sz w:val="24"/>
+          <w:szCs w:val="24"/>
+        </w:rPr>
+        <w:t xml:space="preserve">3. قائمة التعبئة</w:t>
+      </w:r>
+    </w:p>
+    <w:p>
+      <w:pPr>
+        <w:pStyle w:val="ListeParagraf"/>
+        <w:bidi/>
+        <w:spacing w:after="80"/>
+        <w:ind w:left="0" w:right="709"/>
+        <w:jc w:val="both"/>
+      </w:pPr>
+      <w:r>
+        <w:rPr>
+          <w:rFonts w:ascii="Calibri" w:hAnsi="Calibri" w:cs="Arial"/>
+          <w:rtl/>
+          <w:sz w:val="24"/>
+          <w:szCs w:val="24"/>
+        </w:rPr>
+        <w:t xml:space="preserve">3.1. سجل لكل كرتونة: رقم الكرتونة والموديل واللون وتوزيع المقاسات والكمية ورقم اللوط والوزن الصافي والإجمالي والأبعاد.</w:t>
+      </w:r>
+    </w:p>
+    <w:p>
+      <w:pPr>
+        <w:pStyle w:val="ListeParagraf"/>
+        <w:bidi/>
+        <w:spacing w:after="80"/>
+        <w:ind w:left="0" w:right="709"/>
+        <w:jc w:val="both"/>
+      </w:pPr>
+      <w:r>
+        <w:rPr>
+          <w:rFonts w:ascii="Calibri" w:hAnsi="Calibri" w:cs="Arial"/>
+          <w:rtl/>
+          <w:sz w:val="24"/>
+          <w:szCs w:val="24"/>
+        </w:rPr>
+        <w:t xml:space="preserve">3.2. طابق الإجماليات حسب الطلبية واللون والمقاس مع كمية الطلبية والكراتين الفعلية، وصحح أي فرق قبل الإفراج.</w:t>
+      </w:r>
+    </w:p>
+    <w:p>
+      <w:pPr>
+        <w:pStyle w:val="ListeParagraf"/>
+        <w:bidi/>
+        <w:spacing w:after="80"/>
+        <w:ind w:left="0" w:right="709"/>
+        <w:jc w:val="both"/>
+      </w:pPr>
+      <w:r>
+        <w:rPr>
+          <w:rFonts w:ascii="Calibri" w:hAnsi="Calibri" w:cs="Arial"/>
+          <w:rtl/>
+          <w:sz w:val="24"/>
+          <w:szCs w:val="24"/>
+        </w:rPr>
+        <w:t xml:space="preserve">3.3. أرسل قائمة التعبئة النهائية الموقعة من موظف الشحن إلى قسم الميرشندايزينغ وإلى الأمن لمراقبة التحميل (EMS.İD.PRO.03.05.).</w:t>
+      </w:r>
+    </w:p>
+    <w:p>
+      <w:pPr>
+        <w:pStyle w:val="ListeParagraf"/>
+        <w:bidi/>
+        <w:spacing w:after="80"/>
+        <w:ind w:left="0" w:right="709"/>
+        <w:jc w:val="both"/>
+      </w:pPr>
+    </w:p>
+    <w:p>
+      <w:pPr>
+        <w:pStyle w:val="ListeParagraf"/>
+        <w:bidi/>
+        <w:spacing w:before="120" w:after="60"/>
+        <w:ind w:left="0" w:right="709"/>
+      </w:pPr>
+      <w:r>
+        <w:rPr>
+          <w:rFonts w:ascii="Calibri" w:hAnsi="Calibri" w:cs="Arial"/>
+          <w:b/>
+          <w:bCs/>
+          <w:rtl/>
+          <w:sz w:val="24"/>
+          <w:szCs w:val="24"/>
+        </w:rPr>
+        <w:t xml:space="preserve">4. سند التسليم والختم والإرسال</w:t>
+      </w:r>
+    </w:p>
+    <w:p>
+      <w:pPr>
+        <w:pStyle w:val="ListeParagraf"/>
+        <w:bidi/>
+        <w:spacing w:after="80"/>
+        <w:ind w:left="0" w:right="709"/>
+        <w:jc w:val="both"/>
+      </w:pPr>
+      <w:r>
+        <w:rPr>
+          <w:rFonts w:ascii="Calibri" w:hAnsi="Calibri" w:cs="Arial"/>
+          <w:rtl/>
+          <w:sz w:val="24"/>
+          <w:szCs w:val="24"/>
+        </w:rPr>
+        <w:t xml:space="preserve">4.1. أعد سند التسليم ومستندات التصدير المطلوبة بما يتفق مع أمر الشحن وقائمة التعبئة؛ ويجب أن تطابق الكمية وعدد الكراتين والوزن قائمة التعبئة تمامًا.</w:t>
+      </w:r>
+    </w:p>
+    <w:p>
+      <w:pPr>
+        <w:pStyle w:val="ListeParagraf"/>
+        <w:bidi/>
+        <w:spacing w:after="80"/>
+        <w:ind w:left="0" w:right="709"/>
+        <w:jc w:val="both"/>
+      </w:pPr>
+      <w:r>
+        <w:rPr>
+          <w:rFonts w:ascii="Calibri" w:hAnsi="Calibri" w:cs="Arial"/>
+          <w:rtl/>
+          <w:sz w:val="24"/>
+          <w:szCs w:val="24"/>
+        </w:rPr>
+        <w:t xml:space="preserve">4.2. قبل التحميل، عدّ الكراتين والباليتات ومطابقتها مع قائمة التعبئة؛ ولا تحمّل كرتونة ذات ملصق ناقص أو زائد أو خاطئ.</w:t>
+      </w:r>
+    </w:p>
+    <w:p>
+      <w:pPr>
+        <w:pStyle w:val="ListeParagraf"/>
+        <w:bidi/>
+        <w:spacing w:after="80"/>
+        <w:ind w:left="0" w:right="709"/>
+        <w:jc w:val="both"/>
+      </w:pPr>
+      <w:r>
+        <w:rPr>
+          <w:rFonts w:ascii="Calibri" w:hAnsi="Calibri" w:cs="Arial"/>
+          <w:rtl/>
+          <w:sz w:val="24"/>
+          <w:szCs w:val="24"/>
+        </w:rPr>
+        <w:t xml:space="preserve">4.3. بعد إغلاق الأبواب، اختم المركبة أو الحاوية بختم مرقم مطابق لـ ISO 17712 بحضور الأمن، وتحقق من الختم بالشد والتدوير.</w:t>
+      </w:r>
+    </w:p>
+    <w:p>
+      <w:pPr>
+        <w:pStyle w:val="ListeParagraf"/>
+        <w:bidi/>
+        <w:spacing w:after="80"/>
+        <w:ind w:left="0" w:right="709"/>
+        <w:jc w:val="both"/>
+      </w:pPr>
+      <w:r>
+        <w:rPr>
+          <w:rFonts w:ascii="Calibri" w:hAnsi="Calibri" w:cs="Arial"/>
+          <w:rtl/>
+          <w:sz w:val="24"/>
+          <w:szCs w:val="24"/>
+        </w:rPr>
+        <w:t xml:space="preserve">4.4. اكتب رقم الختم على سند التسليم وقائمة التعبئة ونموذج التحميل، والتقط صورة للختم وفق EMS.QA.PRO.02.04.</w:t>
+      </w:r>
+    </w:p>
+    <w:p>
+      <w:pPr>
+        <w:pStyle w:val="ListeParagraf"/>
+        <w:bidi/>
+        <w:spacing w:after="80"/>
+        <w:ind w:left="0" w:right="709"/>
+        <w:jc w:val="both"/>
+      </w:pPr>
+      <w:r>
+        <w:rPr>
+          <w:rFonts w:ascii="Calibri" w:hAnsi="Calibri" w:cs="Arial"/>
+          <w:rtl/>
+          <w:sz w:val="24"/>
+          <w:szCs w:val="24"/>
+        </w:rPr>
+        <w:t xml:space="preserve">4.5. لا تُحمَّل إلا اللوطات التي تحمل نتيجة «ناجح» من الفحص النهائي (EMS.QA.FRM.05.05) وملصق إفراج ضمان الجودة (EMS.QA.PRO.02.14). ولا يقبل الأمن وموظف الشحن كرتونة من لوط غير مفرج عنه.</w:t>
+      </w:r>
+    </w:p>
+    <w:p>
+      <w:pPr>
+        <w:pStyle w:val="ListeParagraf"/>
+        <w:bidi/>
+        <w:spacing w:after="80"/>
+        <w:ind w:left="0" w:right="709"/>
+        <w:jc w:val="both"/>
+      </w:pPr>
+      <w:r>
+        <w:rPr>
+          <w:rFonts w:ascii="Calibri" w:hAnsi="Calibri" w:cs="Arial"/>
+          <w:rtl/>
+          <w:sz w:val="24"/>
+          <w:szCs w:val="24"/>
+        </w:rPr>
+        <w:t xml:space="preserve">4.6. يوقّع نموذج الخروج ممثل مدير المستودعات وضمان الجودة والأمن، ويُسجَّل اسم السائق ورقم اللوحة. وإذا لم تتطابق بيانات المستند أو الكمية أو الختم، يوقف الخروج حتى يُحل الفرق.</w:t>
+      </w:r>
+    </w:p>
+    <w:p>
+      <w:pPr>
+        <w:pStyle w:val="ListeParagraf"/>
+        <w:bidi/>
+        <w:spacing w:after="80"/>
+        <w:ind w:left="0" w:right="709"/>
+        <w:jc w:val="both"/>
+      </w:pPr>
+    </w:p>
+    <w:p>
+      <w:pPr>
+        <w:pStyle w:val="ListeParagraf"/>
+        <w:bidi/>
+        <w:spacing w:before="120" w:after="60"/>
+        <w:ind w:left="0" w:right="709"/>
+      </w:pPr>
+      <w:r>
+        <w:rPr>
+          <w:rFonts w:ascii="Calibri" w:hAnsi="Calibri" w:cs="Arial"/>
+          <w:b/>
+          <w:bCs/>
+          <w:rtl/>
+          <w:sz w:val="24"/>
+          <w:szCs w:val="24"/>
+        </w:rPr>
+        <w:t xml:space="preserve">5. سجل الطلبية والدفعة واللوط</w:t>
+      </w:r>
+    </w:p>
+    <w:p>
+      <w:pPr>
+        <w:pStyle w:val="ListeParagraf"/>
+        <w:bidi/>
+        <w:spacing w:after="80"/>
+        <w:ind w:left="0" w:right="709"/>
+        <w:jc w:val="both"/>
+      </w:pPr>
+      <w:r>
+        <w:rPr>
+          <w:rFonts w:ascii="Calibri" w:hAnsi="Calibri" w:cs="Arial"/>
+          <w:rtl/>
+          <w:sz w:val="24"/>
+          <w:szCs w:val="24"/>
+        </w:rPr>
+        <w:t xml:space="preserve">5.1. بعد الإرسال، سجل أرقام الطلبية والدفعة واللوط (كما على ملصقات اللوط) للبضاعة ونطاق الكراتين ورقم الختم ولوحة المركبة وتاريخ الإرسال وبيانات التسليم في سجل التتبع.</w:t>
+      </w:r>
+    </w:p>
+    <w:p>
+      <w:pPr>
+        <w:pStyle w:val="ListeParagraf"/>
+        <w:bidi/>
+        <w:spacing w:after="80"/>
+        <w:ind w:left="0" w:right="709"/>
+        <w:jc w:val="both"/>
+      </w:pPr>
+      <w:r>
+        <w:rPr>
+          <w:rFonts w:ascii="Calibri" w:hAnsi="Calibri" w:cs="Arial"/>
+          <w:rtl/>
+          <w:sz w:val="24"/>
+          <w:szCs w:val="24"/>
+        </w:rPr>
+        <w:t xml:space="preserve">5.2. أبقِ السجل مرتبطًا بقائمة التعبئة بحيث يمكن تتبع أي كرتونة للخلف إلى دفعة إنتاجها وللأمام إلى العميل؛ ويجب أن يكون التتبع للخلف عند طلب العميل ممكنًا خلال 4 ساعات (EMS.QA.PRO.02.08.).</w:t>
+      </w:r>
+    </w:p>
+    <w:p>
+      <w:pPr>
+        <w:pStyle w:val="ListeParagraf"/>
+        <w:bidi/>
+        <w:spacing w:after="80"/>
+        <w:ind w:left="0" w:right="709"/>
+        <w:jc w:val="both"/>
+      </w:pPr>
+      <w:r>
+        <w:rPr>
+          <w:rFonts w:ascii="Calibri" w:hAnsi="Calibri" w:cs="Arial"/>
+          <w:rtl/>
+          <w:sz w:val="24"/>
+          <w:szCs w:val="24"/>
+        </w:rPr>
+        <w:t xml:space="preserve">5.3. أرسل البضاعة وفق مبدأ الوارد أولًا يصرف أولًا ضمن الطلبية واللون نفسيهما ما لم يطلب العميل غير ذلك.</w:t>
+      </w:r>
+    </w:p>
+    <w:p>
+      <w:pPr>
+        <w:pStyle w:val="ListeParagraf"/>
+        <w:bidi/>
+        <w:spacing w:after="80"/>
+        <w:ind w:left="0" w:right="709"/>
+        <w:jc w:val="both"/>
+      </w:pPr>
+    </w:p>
+    <w:p>
+      <w:pPr>
+        <w:pStyle w:val="ListeParagraf"/>
+        <w:bidi/>
+        <w:spacing w:before="120" w:after="60"/>
+        <w:ind w:left="0" w:right="709"/>
+      </w:pPr>
+      <w:r>
+        <w:rPr>
+          <w:rFonts w:ascii="Calibri" w:hAnsi="Calibri" w:cs="Arial"/>
+          <w:b/>
+          <w:bCs/>
+          <w:rtl/>
+          <w:sz w:val="24"/>
+          <w:szCs w:val="24"/>
+        </w:rPr>
+        <w:t xml:space="preserve">6. الفحوص ومعايير القبول</w:t>
       </w:r>
     </w:p>
     <w:p>
@@ -2971,7 +2999,7 @@
           <w:sz w:val="24"/>
           <w:szCs w:val="24"/>
         </w:rPr>
-        <w:t xml:space="preserve">لا تغيّر قائمة التعبئة بعد التحميل دون موافقة مدير المستودعات وقسم الميرشندايزينغ.</w:t>
+        <w:t xml:space="preserve">علامات الكراتين وملصقاتها وملصقات اللوط وأرقامها: مطابقة 100 % لتعليمات تعبئة العميل؛ والباركود مقروء بالماسح الضوئي؛ ورقم اللوط متطابق على الملصق والكرتونة وقائمة التعبئة.</w:t>
       </w:r>
     </w:p>
     <w:p>
@@ -2992,117 +3020,7 @@
           <w:sz w:val="24"/>
           <w:szCs w:val="24"/>
         </w:rPr>
-        <w:t xml:space="preserve">لا تسلّم الأختام للسائقين ولا تترك مركبة مختومة أو محملة دون مراقبة.</w:t>
-      </w:r>
-    </w:p>
-    <w:p>
-      <w:pPr>
-        <w:pStyle w:val="ListeParagraf"/>
-        <w:bidi/>
-        <w:spacing w:after="80"/>
-        <w:ind w:left="0" w:right="709"/>
-        <w:jc w:val="both"/>
-      </w:pPr>
-    </w:p>
-    <w:p>
-      <w:pPr>
-        <w:pStyle w:val="ListeParagraf"/>
-        <w:bidi/>
-        <w:spacing w:before="120" w:after="60"/>
-        <w:ind w:left="0" w:right="709"/>
-      </w:pPr>
-      <w:r>
-        <w:rPr>
-          <w:rFonts w:ascii="Calibri" w:hAnsi="Calibri" w:cs="Arial"/>
-          <w:b/>
-          <w:bCs/>
-          <w:rtl/>
-          <w:sz w:val="24"/>
-          <w:szCs w:val="24"/>
-        </w:rPr>
-        <w:t xml:space="preserve">8. في حالة وجود مشكلة</w:t>
-      </w:r>
-    </w:p>
-    <w:p>
-      <w:pPr>
-        <w:pStyle w:val="ListeParagraf"/>
-        <w:bidi/>
-        <w:spacing w:after="80"/>
-        <w:ind w:left="0" w:right="709"/>
-        <w:jc w:val="both"/>
-      </w:pPr>
-      <w:r>
-        <w:rPr>
-          <w:rFonts w:ascii="Calibri" w:hAnsi="Calibri" w:cs="Arial"/>
-          <w:rtl/>
-          <w:sz w:val="24"/>
-          <w:szCs w:val="24"/>
-        </w:rPr>
-        <w:t xml:space="preserve">8.1. إذا وُجدت علامة أو ملصق أو رقم كرتونة خاطئ، أوقف التعبئة واحجز الكراتين المتأثرة وأبلغ مشرف التعبئة وضمان الجودة.</w:t>
-      </w:r>
-    </w:p>
-    <w:p>
-      <w:pPr>
-        <w:pStyle w:val="ListeParagraf"/>
-        <w:bidi/>
-        <w:spacing w:after="80"/>
-        <w:ind w:left="0" w:right="709"/>
-        <w:jc w:val="both"/>
-      </w:pPr>
-      <w:r>
-        <w:rPr>
-          <w:rFonts w:ascii="Calibri" w:hAnsi="Calibri" w:cs="Arial"/>
-          <w:rtl/>
-          <w:sz w:val="24"/>
-          <w:szCs w:val="24"/>
-        </w:rPr>
-        <w:t xml:space="preserve">8.2. عند شحنة خاطئة أو ناقصة أو عدم تطابق المستندات أو الختم أو شكوى من العميل، أوقف الإرسال (أو أبلغ الناقل والعميل إن كانت الشحنة على الطريق)، وعزل البضاعة المتأثرة، وافتح سجل عدم مطابقة (DOP) وفق EMS.KS.PRO.22.02. وEMS.KS.PRO.22.03.</w:t>
-      </w:r>
-    </w:p>
-    <w:p>
-      <w:pPr>
-        <w:pStyle w:val="ListeParagraf"/>
-        <w:bidi/>
-        <w:spacing w:after="80"/>
-        <w:ind w:left="0" w:right="709"/>
-        <w:jc w:val="both"/>
-      </w:pPr>
-      <w:r>
-        <w:rPr>
-          <w:rFonts w:ascii="Calibri" w:hAnsi="Calibri" w:cs="Arial"/>
-          <w:rtl/>
-          <w:sz w:val="24"/>
-          <w:szCs w:val="24"/>
-        </w:rPr>
-        <w:t xml:space="preserve">8.3. ابدأ تحليل السبب الجذري خلال 24 ساعة؛ ولا يُغلق الإجراء التصحيحي (DOP) إلا بعد التحقق من فعالية الإجراء على ثلاث شحنات متتالية.</w:t>
-      </w:r>
-    </w:p>
-    <w:p>
-      <w:pPr>
-        <w:pStyle w:val="ListeParagraf"/>
-        <w:bidi/>
-        <w:spacing w:after="80"/>
-        <w:ind w:left="0" w:right="709"/>
-        <w:jc w:val="both"/>
-      </w:pPr>
-    </w:p>
-    <w:p>
-      <w:pPr>
-        <w:pStyle w:val="ListeParagraf"/>
-        <w:bidi/>
-        <w:spacing w:before="120" w:after="60"/>
-        <w:ind w:left="0" w:right="709"/>
-      </w:pPr>
-      <w:r>
-        <w:rPr>
-          <w:rFonts w:ascii="Calibri" w:hAnsi="Calibri" w:cs="Arial"/>
-          <w:b/>
-          <w:bCs/>
-          <w:rtl/>
-          <w:sz w:val="24"/>
-          <w:szCs w:val="24"/>
-        </w:rPr>
-        <w:t xml:space="preserve">9. الوثائق والسجلات ذات الصلة</w:t>
+        <w:t xml:space="preserve">قائمة التعبئة مقابل الكراتين: تطابق 100 % حسب الطلبية واللون والمقاس قبل الإفراج.</w:t>
       </w:r>
     </w:p>
     <w:p>
@@ -3123,7 +3041,7 @@
           <w:sz w:val="24"/>
           <w:szCs w:val="24"/>
         </w:rPr>
-        <w:t xml:space="preserve">EMS.SO.PRO.23.07. إجراء التشغيل القياسي – تعبئة الكراتين وتجهيز الشحنة</w:t>
+        <w:t xml:space="preserve">سند التسليم وقائمة التعبئة وأمر الشحن: اتساق 100 %؛ ورقم الختم متطابق في جميع المستندات.</w:t>
       </w:r>
     </w:p>
     <w:p>
@@ -3144,7 +3062,35 @@
           <w:sz w:val="24"/>
           <w:szCs w:val="24"/>
         </w:rPr>
-        <w:t xml:space="preserve">EMS.DP.PRO.08.02. إجراء الشحن والإرسال</w:t>
+        <w:t xml:space="preserve">تُحدد الحدود والتسامحات في مواصفات العميل وسياسة الشركة؛ والقيم أعلاه أمثلة.</w:t>
+      </w:r>
+    </w:p>
+    <w:p>
+      <w:pPr>
+        <w:pStyle w:val="ListeParagraf"/>
+        <w:bidi/>
+        <w:spacing w:after="80"/>
+        <w:ind w:left="0" w:right="709"/>
+        <w:jc w:val="both"/>
+      </w:pPr>
+    </w:p>
+    <w:p>
+      <w:pPr>
+        <w:pStyle w:val="ListeParagraf"/>
+        <w:bidi/>
+        <w:spacing w:before="120" w:after="60"/>
+        <w:ind w:left="0" w:right="709"/>
+      </w:pPr>
+      <w:r>
+        <w:rPr>
+          <w:rFonts w:ascii="Calibri" w:hAnsi="Calibri" w:cs="Arial"/>
+          <w:b/>
+          <w:bCs/>
+          <w:rtl/>
+          <w:sz w:val="24"/>
+          <w:szCs w:val="24"/>
+        </w:rPr>
+        <w:t xml:space="preserve">7. المحظورات</w:t>
       </w:r>
     </w:p>
     <w:p>
@@ -3165,7 +3111,7 @@
           <w:sz w:val="24"/>
           <w:szCs w:val="24"/>
         </w:rPr>
-        <w:t xml:space="preserve">EMS.QA.PRO.02.04. إجراء إدارة الأختام</w:t>
+        <w:t xml:space="preserve">لا تستخدم التصحيحات بخط اليد على علامات الكراتين أو الملصقات؛ استبدل الملصق أو الكرتونة.</w:t>
       </w:r>
     </w:p>
     <w:p>
@@ -3186,7 +3132,7 @@
           <w:sz w:val="24"/>
           <w:szCs w:val="24"/>
         </w:rPr>
-        <w:t xml:space="preserve">EMS.QA.PRO.02.08. إجراء التتبع وسحب المنتج</w:t>
+        <w:t xml:space="preserve">لا تستخدم ملصقات طلبية أخرى أو مراجعات قديمة أو ملصقات تالفة.</w:t>
       </w:r>
     </w:p>
     <w:p>
@@ -3207,7 +3153,7 @@
           <w:sz w:val="24"/>
           <w:szCs w:val="24"/>
         </w:rPr>
-        <w:t xml:space="preserve">EMS.İD.PRO.03.05. إجراء أمن تحميل الحاويات والشاحنات</w:t>
+        <w:t xml:space="preserve">لا تغيّر قائمة التعبئة بعد التحميل دون موافقة مدير المستودعات وقسم الميرشندايزينغ.</w:t>
       </w:r>
     </w:p>
     <w:p>
@@ -3228,7 +3174,117 @@
           <w:sz w:val="24"/>
           <w:szCs w:val="24"/>
         </w:rPr>
-        <w:t xml:space="preserve">EMS.KS.PRO.22.02. إجراء التحكم في المنتج غير المطابق</w:t>
+        <w:t xml:space="preserve">لا تسلّم الأختام للسائقين ولا تترك مركبة مختومة أو محملة دون مراقبة.</w:t>
+      </w:r>
+    </w:p>
+    <w:p>
+      <w:pPr>
+        <w:pStyle w:val="ListeParagraf"/>
+        <w:bidi/>
+        <w:spacing w:after="80"/>
+        <w:ind w:left="0" w:right="709"/>
+        <w:jc w:val="both"/>
+      </w:pPr>
+    </w:p>
+    <w:p>
+      <w:pPr>
+        <w:pStyle w:val="ListeParagraf"/>
+        <w:bidi/>
+        <w:spacing w:before="120" w:after="60"/>
+        <w:ind w:left="0" w:right="709"/>
+      </w:pPr>
+      <w:r>
+        <w:rPr>
+          <w:rFonts w:ascii="Calibri" w:hAnsi="Calibri" w:cs="Arial"/>
+          <w:b/>
+          <w:bCs/>
+          <w:rtl/>
+          <w:sz w:val="24"/>
+          <w:szCs w:val="24"/>
+        </w:rPr>
+        <w:t xml:space="preserve">8. في حالة وجود مشكلة</w:t>
+      </w:r>
+    </w:p>
+    <w:p>
+      <w:pPr>
+        <w:pStyle w:val="ListeParagraf"/>
+        <w:bidi/>
+        <w:spacing w:after="80"/>
+        <w:ind w:left="0" w:right="709"/>
+        <w:jc w:val="both"/>
+      </w:pPr>
+      <w:r>
+        <w:rPr>
+          <w:rFonts w:ascii="Calibri" w:hAnsi="Calibri" w:cs="Arial"/>
+          <w:rtl/>
+          <w:sz w:val="24"/>
+          <w:szCs w:val="24"/>
+        </w:rPr>
+        <w:t xml:space="preserve">8.1. إذا وُجدت علامة أو ملصق أو رقم كرتونة خاطئ، أوقف التعبئة واحجز الكراتين المتأثرة وأبلغ مشرف التعبئة وضمان الجودة.</w:t>
+      </w:r>
+    </w:p>
+    <w:p>
+      <w:pPr>
+        <w:pStyle w:val="ListeParagraf"/>
+        <w:bidi/>
+        <w:spacing w:after="80"/>
+        <w:ind w:left="0" w:right="709"/>
+        <w:jc w:val="both"/>
+      </w:pPr>
+      <w:r>
+        <w:rPr>
+          <w:rFonts w:ascii="Calibri" w:hAnsi="Calibri" w:cs="Arial"/>
+          <w:rtl/>
+          <w:sz w:val="24"/>
+          <w:szCs w:val="24"/>
+        </w:rPr>
+        <w:t xml:space="preserve">8.2. عند شحنة خاطئة أو ناقصة أو عدم تطابق المستندات أو الختم أو شكوى من العميل، أوقف الإرسال (أو أبلغ الناقل والعميل إن كانت الشحنة على الطريق)، وعزل البضاعة المتأثرة، وافتح سجل عدم مطابقة (DOP) وفق EMS.KS.PRO.22.02. وEMS.KS.PRO.22.03.</w:t>
+      </w:r>
+    </w:p>
+    <w:p>
+      <w:pPr>
+        <w:pStyle w:val="ListeParagraf"/>
+        <w:bidi/>
+        <w:spacing w:after="80"/>
+        <w:ind w:left="0" w:right="709"/>
+        <w:jc w:val="both"/>
+      </w:pPr>
+      <w:r>
+        <w:rPr>
+          <w:rFonts w:ascii="Calibri" w:hAnsi="Calibri" w:cs="Arial"/>
+          <w:rtl/>
+          <w:sz w:val="24"/>
+          <w:szCs w:val="24"/>
+        </w:rPr>
+        <w:t xml:space="preserve">8.3. ابدأ تحليل السبب الجذري خلال 24 ساعة؛ ولا يُغلق الإجراء التصحيحي (DOP) إلا بعد التحقق من فعالية الإجراء على ثلاث شحنات متتالية.</w:t>
+      </w:r>
+    </w:p>
+    <w:p>
+      <w:pPr>
+        <w:pStyle w:val="ListeParagraf"/>
+        <w:bidi/>
+        <w:spacing w:after="80"/>
+        <w:ind w:left="0" w:right="709"/>
+        <w:jc w:val="both"/>
+      </w:pPr>
+    </w:p>
+    <w:p>
+      <w:pPr>
+        <w:pStyle w:val="ListeParagraf"/>
+        <w:bidi/>
+        <w:spacing w:before="120" w:after="60"/>
+        <w:ind w:left="0" w:right="709"/>
+      </w:pPr>
+      <w:r>
+        <w:rPr>
+          <w:rFonts w:ascii="Calibri" w:hAnsi="Calibri" w:cs="Arial"/>
+          <w:b/>
+          <w:bCs/>
+          <w:rtl/>
+          <w:sz w:val="24"/>
+          <w:szCs w:val="24"/>
+        </w:rPr>
+        <w:t xml:space="preserve">9. الوثائق والسجلات ذات الصلة</w:t>
       </w:r>
     </w:p>
     <w:p>
@@ -3249,7 +3305,7 @@
           <w:sz w:val="24"/>
           <w:szCs w:val="24"/>
         </w:rPr>
-        <w:t xml:space="preserve">EMS.KS.PRO.22.03. إجراء الإجراءات التصحيحية والوقائية (CAPA) لمشاكل الجودة</w:t>
+        <w:t xml:space="preserve">EMS.SO.PRO.23.07. إجراء التشغيل القياسي – تعبئة الكراتين وتجهيز الشحنة</w:t>
       </w:r>
     </w:p>
     <w:p>
@@ -3270,7 +3326,259 @@
           <w:sz w:val="24"/>
           <w:szCs w:val="24"/>
         </w:rPr>
-        <w:t xml:space="preserve">نظام الجودة: EMS.DP.TL.08.04 وEMS.DP.TL.08.04 وEMS.DP.PRO.08.02 ونموذج مراقبة التحميل EMS.DP.FRM.08.04 ونموذج الخروج EMS.DP.FRM.08.05 ونموذج سجل التتبع EMS.DP.FRM.08.06</w:t>
+        <w:t xml:space="preserve">EMS.ÜR.PRO.05.10. إجراء الكي والمراقبة النهائية والتعبئة</w:t>
+      </w:r>
+    </w:p>
+    <w:p>
+      <w:pPr>
+        <w:pStyle w:val="ListeParagraf"/>
+        <w:numPr>
+          <w:ilvl w:val="0"/>
+          <w:numId w:val="1"/>
+        </w:numPr>
+        <w:bidi/>
+        <w:spacing w:after="60"/>
+        <w:jc w:val="both"/>
+      </w:pPr>
+      <w:r>
+        <w:rPr>
+          <w:rFonts w:ascii="Calibri" w:hAnsi="Calibri" w:cs="Arial"/>
+          <w:rtl/>
+          <w:sz w:val="24"/>
+          <w:szCs w:val="24"/>
+        </w:rPr>
+        <w:t xml:space="preserve">EMS.ÜR.PRO.05.12. إجراء تقسيم المنتجات النهائية إلى لوطات وتعريف اللوط</w:t>
+      </w:r>
+    </w:p>
+    <w:p>
+      <w:pPr>
+        <w:pStyle w:val="ListeParagraf"/>
+        <w:numPr>
+          <w:ilvl w:val="0"/>
+          <w:numId w:val="1"/>
+        </w:numPr>
+        <w:bidi/>
+        <w:spacing w:after="60"/>
+        <w:jc w:val="both"/>
+      </w:pPr>
+      <w:r>
+        <w:rPr>
+          <w:rFonts w:ascii="Calibri" w:hAnsi="Calibri" w:cs="Arial"/>
+          <w:rtl/>
+          <w:sz w:val="24"/>
+          <w:szCs w:val="24"/>
+        </w:rPr>
+        <w:t xml:space="preserve">EMS.ÜR.TL.05.14. تعليمات ترقيم لوطات المنتجات النهائية ووضع ملصقاتها</w:t>
+      </w:r>
+    </w:p>
+    <w:p>
+      <w:pPr>
+        <w:pStyle w:val="ListeParagraf"/>
+        <w:numPr>
+          <w:ilvl w:val="0"/>
+          <w:numId w:val="1"/>
+        </w:numPr>
+        <w:bidi/>
+        <w:spacing w:after="60"/>
+        <w:jc w:val="both"/>
+      </w:pPr>
+      <w:r>
+        <w:rPr>
+          <w:rFonts w:ascii="Calibri" w:hAnsi="Calibri" w:cs="Arial"/>
+          <w:rtl/>
+          <w:sz w:val="24"/>
+          <w:szCs w:val="24"/>
+        </w:rPr>
+        <w:t xml:space="preserve">EMS.ÜR.TL.05.13. تعليمات الطي والأكياس والتغليف</w:t>
+      </w:r>
+    </w:p>
+    <w:p>
+      <w:pPr>
+        <w:pStyle w:val="ListeParagraf"/>
+        <w:numPr>
+          <w:ilvl w:val="0"/>
+          <w:numId w:val="1"/>
+        </w:numPr>
+        <w:bidi/>
+        <w:spacing w:after="60"/>
+        <w:jc w:val="both"/>
+      </w:pPr>
+      <w:r>
+        <w:rPr>
+          <w:rFonts w:ascii="Calibri" w:hAnsi="Calibri" w:cs="Arial"/>
+          <w:rtl/>
+          <w:sz w:val="24"/>
+          <w:szCs w:val="24"/>
+        </w:rPr>
+        <w:t xml:space="preserve">EMS.QA.PRO.02.14. إجراء الفحص النهائي والإفراج</w:t>
+      </w:r>
+    </w:p>
+    <w:p>
+      <w:pPr>
+        <w:pStyle w:val="ListeParagraf"/>
+        <w:numPr>
+          <w:ilvl w:val="0"/>
+          <w:numId w:val="1"/>
+        </w:numPr>
+        <w:bidi/>
+        <w:spacing w:after="60"/>
+        <w:jc w:val="both"/>
+      </w:pPr>
+      <w:r>
+        <w:rPr>
+          <w:rFonts w:ascii="Calibri" w:hAnsi="Calibri" w:cs="Arial"/>
+          <w:rtl/>
+          <w:sz w:val="24"/>
+          <w:szCs w:val="24"/>
+        </w:rPr>
+        <w:t xml:space="preserve">EMS.ÜR.FRM.05.11 نموذج مراقبة ترتيب الكراتين وقائمة التعبئة؛ EMS.ÜR.FRM.05.10 نموذج سجل اللوطات وملصقات اللوط؛ EMS.QA.FRM.05.05 تقرير الفحص النهائي قبل الشحن</w:t>
+      </w:r>
+    </w:p>
+    <w:p>
+      <w:pPr>
+        <w:pStyle w:val="ListeParagraf"/>
+        <w:numPr>
+          <w:ilvl w:val="0"/>
+          <w:numId w:val="1"/>
+        </w:numPr>
+        <w:bidi/>
+        <w:spacing w:after="60"/>
+        <w:jc w:val="both"/>
+      </w:pPr>
+      <w:r>
+        <w:rPr>
+          <w:rFonts w:ascii="Calibri" w:hAnsi="Calibri" w:cs="Arial"/>
+          <w:rtl/>
+          <w:sz w:val="24"/>
+          <w:szCs w:val="24"/>
+        </w:rPr>
+        <w:t xml:space="preserve">EMS.DP.PRO.08.02. إجراء الشحن والإرسال</w:t>
+      </w:r>
+    </w:p>
+    <w:p>
+      <w:pPr>
+        <w:pStyle w:val="ListeParagraf"/>
+        <w:numPr>
+          <w:ilvl w:val="0"/>
+          <w:numId w:val="1"/>
+        </w:numPr>
+        <w:bidi/>
+        <w:spacing w:after="60"/>
+        <w:jc w:val="both"/>
+      </w:pPr>
+      <w:r>
+        <w:rPr>
+          <w:rFonts w:ascii="Calibri" w:hAnsi="Calibri" w:cs="Arial"/>
+          <w:rtl/>
+          <w:sz w:val="24"/>
+          <w:szCs w:val="24"/>
+        </w:rPr>
+        <w:t xml:space="preserve">EMS.QA.PRO.02.04. إجراء إدارة الأختام</w:t>
+      </w:r>
+    </w:p>
+    <w:p>
+      <w:pPr>
+        <w:pStyle w:val="ListeParagraf"/>
+        <w:numPr>
+          <w:ilvl w:val="0"/>
+          <w:numId w:val="1"/>
+        </w:numPr>
+        <w:bidi/>
+        <w:spacing w:after="60"/>
+        <w:jc w:val="both"/>
+      </w:pPr>
+      <w:r>
+        <w:rPr>
+          <w:rFonts w:ascii="Calibri" w:hAnsi="Calibri" w:cs="Arial"/>
+          <w:rtl/>
+          <w:sz w:val="24"/>
+          <w:szCs w:val="24"/>
+        </w:rPr>
+        <w:t xml:space="preserve">EMS.QA.PRO.02.08. إجراء التتبع وسحب المنتج</w:t>
+      </w:r>
+    </w:p>
+    <w:p>
+      <w:pPr>
+        <w:pStyle w:val="ListeParagraf"/>
+        <w:numPr>
+          <w:ilvl w:val="0"/>
+          <w:numId w:val="1"/>
+        </w:numPr>
+        <w:bidi/>
+        <w:spacing w:after="60"/>
+        <w:jc w:val="both"/>
+      </w:pPr>
+      <w:r>
+        <w:rPr>
+          <w:rFonts w:ascii="Calibri" w:hAnsi="Calibri" w:cs="Arial"/>
+          <w:rtl/>
+          <w:sz w:val="24"/>
+          <w:szCs w:val="24"/>
+        </w:rPr>
+        <w:t xml:space="preserve">EMS.İD.PRO.03.05. إجراء أمن تحميل الحاويات والشاحنات</w:t>
+      </w:r>
+    </w:p>
+    <w:p>
+      <w:pPr>
+        <w:pStyle w:val="ListeParagraf"/>
+        <w:numPr>
+          <w:ilvl w:val="0"/>
+          <w:numId w:val="1"/>
+        </w:numPr>
+        <w:bidi/>
+        <w:spacing w:after="60"/>
+        <w:jc w:val="both"/>
+      </w:pPr>
+      <w:r>
+        <w:rPr>
+          <w:rFonts w:ascii="Calibri" w:hAnsi="Calibri" w:cs="Arial"/>
+          <w:rtl/>
+          <w:sz w:val="24"/>
+          <w:szCs w:val="24"/>
+        </w:rPr>
+        <w:t xml:space="preserve">EMS.KS.PRO.22.02. إجراء التحكم في المنتج غير المطابق</w:t>
+      </w:r>
+    </w:p>
+    <w:p>
+      <w:pPr>
+        <w:pStyle w:val="ListeParagraf"/>
+        <w:numPr>
+          <w:ilvl w:val="0"/>
+          <w:numId w:val="1"/>
+        </w:numPr>
+        <w:bidi/>
+        <w:spacing w:after="60"/>
+        <w:jc w:val="both"/>
+      </w:pPr>
+      <w:r>
+        <w:rPr>
+          <w:rFonts w:ascii="Calibri" w:hAnsi="Calibri" w:cs="Arial"/>
+          <w:rtl/>
+          <w:sz w:val="24"/>
+          <w:szCs w:val="24"/>
+        </w:rPr>
+        <w:t xml:space="preserve">EMS.KS.PRO.22.03. إجراء الإجراءات التصحيحية والوقائية (CAPA) لمشاكل الجودة</w:t>
+      </w:r>
+    </w:p>
+    <w:p>
+      <w:pPr>
+        <w:pStyle w:val="ListeParagraf"/>
+        <w:numPr>
+          <w:ilvl w:val="0"/>
+          <w:numId w:val="1"/>
+        </w:numPr>
+        <w:bidi/>
+        <w:spacing w:after="60"/>
+        <w:jc w:val="both"/>
+      </w:pPr>
+      <w:r>
+        <w:rPr>
+          <w:rFonts w:ascii="Calibri" w:hAnsi="Calibri" w:cs="Arial"/>
+          <w:rtl/>
+          <w:sz w:val="24"/>
+          <w:szCs w:val="24"/>
+        </w:rPr>
+        <w:t xml:space="preserve">نموذج مراقبة التحميل EMS.DP.FRM.08.04؛ نموذج الخروج EMS.DP.FRM.08.05؛ نموذج سجل التتبع EMS.DP.FRM.08.06</w:t>
       </w:r>
     </w:p>
     <w:p>
@@ -5172,7 +5480,7 @@
               <w:sz w:val="16"/>
               <w:szCs w:val="16"/>
             </w:rPr>
-            <w:t>1</w:t>
+            <w:t>4</w:t>
           </w:r>
         </w:p>
         <w:p>

</xml_diff>